<commit_message>
add empty lines after each subtask in 4th task
</commit_message>
<xml_diff>
--- a/Отчет лабораторная 1.docx
+++ b/Отчет лабораторная 1.docx
@@ -5495,10 +5495,10 @@
           <w:noProof/>
         </w:rPr>
         <w:drawing>
-          <wp:inline distT="0" distB="0" distL="0" distR="0" wp14:anchorId="6F50A700" wp14:editId="7F5C4640">
-            <wp:extent cx="5936615" cy="3184525"/>
-            <wp:effectExtent l="0" t="0" r="0" b="3175"/>
-            <wp:docPr id="649195877" name="Picture 1"/>
+          <wp:inline distT="0" distB="0" distL="0" distR="0" wp14:anchorId="646DF8D8" wp14:editId="2CD17BC3">
+            <wp:extent cx="5936615" cy="2642235"/>
+            <wp:effectExtent l="0" t="0" r="0" b="0"/>
+            <wp:docPr id="38336926" name="Picture 1"/>
             <wp:cNvGraphicFramePr>
               <a:graphicFrameLocks xmlns:a="http://schemas.openxmlformats.org/drawingml/2006/main" noChangeAspect="1"/>
             </wp:cNvGraphicFramePr>
@@ -5506,7 +5506,7 @@
               <a:graphicData uri="http://schemas.openxmlformats.org/drawingml/2006/picture">
                 <pic:pic xmlns:pic="http://schemas.openxmlformats.org/drawingml/2006/picture">
                   <pic:nvPicPr>
-                    <pic:cNvPr id="649195877" name=""/>
+                    <pic:cNvPr id="38336926" name=""/>
                     <pic:cNvPicPr/>
                   </pic:nvPicPr>
                   <pic:blipFill>
@@ -5518,7 +5518,7 @@
                   <pic:spPr>
                     <a:xfrm>
                       <a:off x="0" y="0"/>
-                      <a:ext cx="5936615" cy="3184525"/>
+                      <a:ext cx="5936615" cy="2642235"/>
                     </a:xfrm>
                     <a:prstGeom prst="rect">
                       <a:avLst/>
@@ -5530,6 +5530,12 @@
           </wp:inline>
         </w:drawing>
       </w:r>
+      <w:r>
+        <w:rPr>
+          <w:noProof/>
+        </w:rPr>
+        <w:t xml:space="preserve"> </w:t>
+      </w:r>
     </w:p>
     <w:p>
       <w:pPr>
@@ -5969,6 +5975,7 @@
     <w:p>
       <w:pPr>
         <w:pStyle w:val="Heading2"/>
+        <w:ind w:firstLine="567"/>
       </w:pPr>
       <w:bookmarkStart w:id="8" w:name="_Toc240548559"/>
       <w:r>
@@ -6016,28 +6023,251 @@
           </wp:inline>
         </w:drawing>
       </w:r>
-      <w:r>
-        <w:t>Вывод</w:t>
-      </w:r>
       <w:bookmarkEnd w:id="8"/>
     </w:p>
     <w:p>
-      <w:r>
-        <w:t xml:space="preserve">В ходе работы развёрнуто рабочее пространство в Dev-контейнере Debian (VS Code + Docker), освоены Git (инициализация, индексация, коммиты, публикация на GitHub) и команды Bash: создание и удаление файлов и каталогов, права доступа, ссылки, поиск и фильтрация конвейерами. Все операции по варианту 8 оформлены исполняемым скриптом lab0.sh; полученные навыки </w:t>
-      </w:r>
-      <w:r>
-        <w:t>– о</w:t>
-      </w:r>
-      <w:r>
-        <w:t>снова повседневной работы разработчика в терминале Linux и с контролем версий.</w:t>
-      </w:r>
-    </w:p>
-    <w:p>
       <w:pPr>
         <w:pStyle w:val="Heading2"/>
+        <w:ind w:firstLine="567"/>
+      </w:pPr>
+      <w:r>
+        <w:t>Рефлексия</w:t>
+      </w:r>
+    </w:p>
+    <w:p>
+      <w:pPr>
+        <w:pStyle w:val="Heading2"/>
+        <w:ind w:firstLine="567"/>
+        <w:rPr>
+          <w:b w:val="0"/>
+          <w:bCs w:val="0"/>
+        </w:rPr>
       </w:pPr>
       <w:bookmarkStart w:id="9" w:name="_Toc240548560"/>
       <w:r>
+        <w:rPr>
+          <w:b w:val="0"/>
+          <w:bCs w:val="0"/>
+        </w:rPr>
+        <w:t xml:space="preserve">В ходе работы научился создавать директории с помощью команды </w:t>
+      </w:r>
+      <w:proofErr w:type="spellStart"/>
+      <w:r>
+        <w:rPr>
+          <w:rFonts w:ascii="Courier New" w:hAnsi="Courier New"/>
+          <w:b w:val="0"/>
+          <w:bCs w:val="0"/>
+          <w:sz w:val="20"/>
+          <w:lang w:val="en-US"/>
+        </w:rPr>
+        <w:t>mkdir</w:t>
+      </w:r>
+      <w:proofErr w:type="spellEnd"/>
+      <w:r>
+        <w:rPr>
+          <w:rFonts w:ascii="Courier New" w:hAnsi="Courier New"/>
+          <w:b w:val="0"/>
+          <w:bCs w:val="0"/>
+          <w:sz w:val="20"/>
+        </w:rPr>
+        <w:t xml:space="preserve"> -</w:t>
+      </w:r>
+      <w:r>
+        <w:rPr>
+          <w:rFonts w:ascii="Courier New" w:hAnsi="Courier New"/>
+          <w:b w:val="0"/>
+          <w:bCs w:val="0"/>
+          <w:sz w:val="20"/>
+          <w:lang w:val="en-US"/>
+        </w:rPr>
+        <w:t>p</w:t>
+      </w:r>
+      <w:r>
+        <w:rPr>
+          <w:b w:val="0"/>
+          <w:bCs w:val="0"/>
+        </w:rPr>
+        <w:t xml:space="preserve">, </w:t>
+      </w:r>
+      <w:r>
+        <w:rPr>
+          <w:b w:val="0"/>
+          <w:bCs w:val="0"/>
+        </w:rPr>
+        <w:t>управлять правами доступа к файлам с помощью восьмеричной и буквенной записи, а также их интерпретировать.</w:t>
+      </w:r>
+      <w:r>
+        <w:rPr>
+          <w:b w:val="0"/>
+          <w:bCs w:val="0"/>
+        </w:rPr>
+        <w:t xml:space="preserve"> </w:t>
+      </w:r>
+      <w:r>
+        <w:rPr>
+          <w:b w:val="0"/>
+          <w:bCs w:val="0"/>
+        </w:rPr>
+        <w:t xml:space="preserve">Научился использовать </w:t>
+      </w:r>
+      <w:r>
+        <w:rPr>
+          <w:b w:val="0"/>
+          <w:bCs w:val="0"/>
+          <w:lang w:val="en-US"/>
+        </w:rPr>
+        <w:t>heredoc</w:t>
+      </w:r>
+      <w:r>
+        <w:rPr>
+          <w:b w:val="0"/>
+          <w:bCs w:val="0"/>
+        </w:rPr>
+        <w:t xml:space="preserve"> </w:t>
+      </w:r>
+      <w:r>
+        <w:rPr>
+          <w:b w:val="0"/>
+          <w:bCs w:val="0"/>
+        </w:rPr>
+        <w:t xml:space="preserve">и команду </w:t>
+      </w:r>
+      <w:r>
+        <w:rPr>
+          <w:rFonts w:ascii="Courier New" w:hAnsi="Courier New"/>
+          <w:b w:val="0"/>
+          <w:bCs w:val="0"/>
+          <w:sz w:val="20"/>
+          <w:lang w:val="en-US"/>
+        </w:rPr>
+        <w:t>cat</w:t>
+      </w:r>
+      <w:r>
+        <w:rPr>
+          <w:b w:val="0"/>
+          <w:bCs w:val="0"/>
+        </w:rPr>
+        <w:t xml:space="preserve"> </w:t>
+      </w:r>
+      <w:r>
+        <w:rPr>
+          <w:b w:val="0"/>
+          <w:bCs w:val="0"/>
+        </w:rPr>
+        <w:t>для заполнения файлов.</w:t>
+      </w:r>
+      <w:r>
+        <w:rPr>
+          <w:b w:val="0"/>
+          <w:bCs w:val="0"/>
+        </w:rPr>
+        <w:t xml:space="preserve"> Узнал, как создавать мягкие и жесткие ссылки. Освоил конвейерный оператор и использовал его для обработки вывода команд. В конце использовать команды </w:t>
+      </w:r>
+      <w:r>
+        <w:rPr>
+          <w:rFonts w:ascii="Courier New" w:hAnsi="Courier New"/>
+          <w:b w:val="0"/>
+          <w:bCs w:val="0"/>
+          <w:sz w:val="20"/>
+          <w:lang w:val="en-US"/>
+        </w:rPr>
+        <w:t>rm</w:t>
+      </w:r>
+      <w:r>
+        <w:rPr>
+          <w:rFonts w:ascii="Courier New" w:hAnsi="Courier New"/>
+          <w:b w:val="0"/>
+          <w:bCs w:val="0"/>
+          <w:sz w:val="20"/>
+        </w:rPr>
+        <w:t xml:space="preserve"> </w:t>
+      </w:r>
+      <w:r>
+        <w:rPr>
+          <w:b w:val="0"/>
+          <w:bCs w:val="0"/>
+        </w:rPr>
+        <w:t xml:space="preserve">и </w:t>
+      </w:r>
+      <w:proofErr w:type="spellStart"/>
+      <w:r>
+        <w:rPr>
+          <w:rFonts w:ascii="Courier New" w:hAnsi="Courier New"/>
+          <w:b w:val="0"/>
+          <w:bCs w:val="0"/>
+          <w:sz w:val="20"/>
+          <w:lang w:val="en-US"/>
+        </w:rPr>
+        <w:t>rmdir</w:t>
+      </w:r>
+      <w:proofErr w:type="spellEnd"/>
+      <w:r>
+        <w:rPr>
+          <w:b w:val="0"/>
+          <w:bCs w:val="0"/>
+        </w:rPr>
+        <w:t xml:space="preserve"> </w:t>
+      </w:r>
+      <w:r>
+        <w:rPr>
+          <w:b w:val="0"/>
+          <w:bCs w:val="0"/>
+        </w:rPr>
+        <w:t>для удаления объектов ФС. В ходе выполнения обращался в справке по командам</w:t>
+      </w:r>
+      <w:r>
+        <w:rPr>
+          <w:b w:val="0"/>
+          <w:bCs w:val="0"/>
+        </w:rPr>
+        <w:t xml:space="preserve"> </w:t>
+      </w:r>
+      <w:r>
+        <w:rPr>
+          <w:b w:val="0"/>
+          <w:bCs w:val="0"/>
+          <w:lang w:val="en-US"/>
+        </w:rPr>
+        <w:t>c</w:t>
+      </w:r>
+      <w:r>
+        <w:rPr>
+          <w:b w:val="0"/>
+          <w:bCs w:val="0"/>
+        </w:rPr>
+        <w:t xml:space="preserve"> </w:t>
+      </w:r>
+      <w:r>
+        <w:rPr>
+          <w:b w:val="0"/>
+          <w:bCs w:val="0"/>
+        </w:rPr>
+        <w:t xml:space="preserve">помощью </w:t>
+      </w:r>
+      <w:r>
+        <w:rPr>
+          <w:rFonts w:ascii="Courier New" w:hAnsi="Courier New"/>
+          <w:b w:val="0"/>
+          <w:bCs w:val="0"/>
+          <w:sz w:val="20"/>
+          <w:lang w:val="en-US"/>
+        </w:rPr>
+        <w:t>man</w:t>
+      </w:r>
+      <w:r>
+        <w:rPr>
+          <w:b w:val="0"/>
+          <w:bCs w:val="0"/>
+        </w:rPr>
+        <w:t>.</w:t>
+      </w:r>
+    </w:p>
+    <w:p>
+      <w:pPr>
+        <w:pStyle w:val="Heading2"/>
+        <w:ind w:firstLine="567"/>
+      </w:pPr>
+      <w:r>
         <w:t>Использование GA</w:t>
       </w:r>
       <w:r>
@@ -6049,64 +6279,223 @@
       <w:bookmarkEnd w:id="9"/>
     </w:p>
     <w:p>
-      <w:pPr>
-        <w:pStyle w:val="Placeholder"/>
-      </w:pPr>
-      <w:r>
-        <w:t>[Да/нет — использовалась ли GAI в ходе выполнения работы. Модель: …]</w:t>
-      </w:r>
-    </w:p>
-    <w:p>
-      <w:pPr>
-        <w:ind w:right="567" w:firstLine="0"/>
-      </w:pPr>
-      <w:r>
-        <w:t xml:space="preserve">Цели использования: </w:t>
-      </w:r>
-    </w:p>
-    <w:p>
-      <w:pPr>
-        <w:pStyle w:val="Placeholder"/>
-      </w:pPr>
-      <w:r>
-        <w:t>[…]</w:t>
-      </w:r>
-    </w:p>
-    <w:p>
-      <w:pPr>
-        <w:ind w:right="567" w:firstLine="0"/>
-      </w:pPr>
-      <w:r>
-        <w:t>История диалога</w:t>
+      <w:r>
+        <w:t xml:space="preserve">В ходе работы использовалась модель </w:t>
+      </w:r>
+      <w:r>
+        <w:rPr>
+          <w:lang w:val="en-US"/>
+        </w:rPr>
+        <w:t>GLM</w:t>
+      </w:r>
+      <w:r>
+        <w:t xml:space="preserve">-5.2 </w:t>
+      </w:r>
+      <w:r>
+        <w:t xml:space="preserve">для </w:t>
+      </w:r>
+      <w:r>
+        <w:t>заполнения шаблона отчёта, написания множества команд по шаблону (заполнения файлов контентом). Диалоги</w:t>
       </w:r>
       <w:r>
         <w:t>:</w:t>
       </w:r>
     </w:p>
     <w:p>
-      <w:pPr>
-        <w:pStyle w:val="Placeholder"/>
-      </w:pPr>
-      <w:r>
-        <w:t>[Промпты и полученные результаты: …]</w:t>
-      </w:r>
-    </w:p>
-    <w:p>
-      <w:r>
-        <w:t>Ссылка на диалог:</w:t>
-      </w:r>
-    </w:p>
-    <w:p>
-      <w:pPr>
-        <w:pStyle w:val="Placeholder"/>
-      </w:pPr>
-      <w:r>
-        <w:t>[…]</w:t>
-      </w:r>
+      <w:hyperlink r:id="rId18" w:history="1">
+        <w:r>
+          <w:rPr>
+            <w:rStyle w:val="Hyperlink"/>
+            <w:lang w:val="en-US"/>
+          </w:rPr>
+          <w:t>https</w:t>
+        </w:r>
+        <w:r>
+          <w:rPr>
+            <w:rStyle w:val="Hyperlink"/>
+          </w:rPr>
+          <w:t>://</w:t>
+        </w:r>
+        <w:proofErr w:type="spellStart"/>
+        <w:r>
+          <w:rPr>
+            <w:rStyle w:val="Hyperlink"/>
+            <w:lang w:val="en-US"/>
+          </w:rPr>
+          <w:t>opncd</w:t>
+        </w:r>
+        <w:proofErr w:type="spellEnd"/>
+        <w:r>
+          <w:rPr>
+            <w:rStyle w:val="Hyperlink"/>
+          </w:rPr>
+          <w:t>.</w:t>
+        </w:r>
+        <w:r>
+          <w:rPr>
+            <w:rStyle w:val="Hyperlink"/>
+            <w:lang w:val="en-US"/>
+          </w:rPr>
+          <w:t>a</w:t>
+        </w:r>
+        <w:r>
+          <w:rPr>
+            <w:rStyle w:val="Hyperlink"/>
+            <w:lang w:val="en-US"/>
+          </w:rPr>
+          <w:t>i</w:t>
+        </w:r>
+        <w:r>
+          <w:rPr>
+            <w:rStyle w:val="Hyperlink"/>
+          </w:rPr>
+          <w:t>/</w:t>
+        </w:r>
+        <w:r>
+          <w:rPr>
+            <w:rStyle w:val="Hyperlink"/>
+            <w:lang w:val="en-US"/>
+          </w:rPr>
+          <w:t>share</w:t>
+        </w:r>
+        <w:r>
+          <w:rPr>
+            <w:rStyle w:val="Hyperlink"/>
+          </w:rPr>
+          <w:t>/</w:t>
+        </w:r>
+        <w:proofErr w:type="spellStart"/>
+        <w:r>
+          <w:rPr>
+            <w:rStyle w:val="Hyperlink"/>
+            <w:lang w:val="en-US"/>
+          </w:rPr>
+          <w:t>Kdq</w:t>
+        </w:r>
+        <w:proofErr w:type="spellEnd"/>
+        <w:r>
+          <w:rPr>
+            <w:rStyle w:val="Hyperlink"/>
+          </w:rPr>
+          <w:t>3</w:t>
+        </w:r>
+        <w:proofErr w:type="spellStart"/>
+        <w:r>
+          <w:rPr>
+            <w:rStyle w:val="Hyperlink"/>
+            <w:lang w:val="en-US"/>
+          </w:rPr>
+          <w:t>SGBh</w:t>
+        </w:r>
+        <w:proofErr w:type="spellEnd"/>
+      </w:hyperlink>
+    </w:p>
+    <w:p>
+      <w:pPr>
+        <w:rPr>
+          <w:lang w:val="en-US"/>
+        </w:rPr>
+      </w:pPr>
+      <w:hyperlink r:id="rId19" w:history="1">
+        <w:r>
+          <w:rPr>
+            <w:rStyle w:val="Hyperlink"/>
+            <w:lang w:val="en-US"/>
+          </w:rPr>
+          <w:t>https</w:t>
+        </w:r>
+        <w:r>
+          <w:rPr>
+            <w:rStyle w:val="Hyperlink"/>
+          </w:rPr>
+          <w:t>://</w:t>
+        </w:r>
+        <w:r>
+          <w:rPr>
+            <w:rStyle w:val="Hyperlink"/>
+            <w:lang w:val="en-US"/>
+          </w:rPr>
+          <w:t>opn</w:t>
+        </w:r>
+        <w:r>
+          <w:rPr>
+            <w:rStyle w:val="Hyperlink"/>
+            <w:lang w:val="en-US"/>
+          </w:rPr>
+          <w:t>c</w:t>
+        </w:r>
+        <w:r>
+          <w:rPr>
+            <w:rStyle w:val="Hyperlink"/>
+            <w:lang w:val="en-US"/>
+          </w:rPr>
+          <w:t>d</w:t>
+        </w:r>
+        <w:r>
+          <w:rPr>
+            <w:rStyle w:val="Hyperlink"/>
+          </w:rPr>
+          <w:t>.</w:t>
+        </w:r>
+        <w:r>
+          <w:rPr>
+            <w:rStyle w:val="Hyperlink"/>
+            <w:lang w:val="en-US"/>
+          </w:rPr>
+          <w:t>ai</w:t>
+        </w:r>
+        <w:r>
+          <w:rPr>
+            <w:rStyle w:val="Hyperlink"/>
+          </w:rPr>
+          <w:t>/</w:t>
+        </w:r>
+        <w:r>
+          <w:rPr>
+            <w:rStyle w:val="Hyperlink"/>
+            <w:lang w:val="en-US"/>
+          </w:rPr>
+          <w:t>share</w:t>
+        </w:r>
+        <w:r>
+          <w:rPr>
+            <w:rStyle w:val="Hyperlink"/>
+          </w:rPr>
+          <w:t>/</w:t>
+        </w:r>
+        <w:r>
+          <w:rPr>
+            <w:rStyle w:val="Hyperlink"/>
+            <w:lang w:val="en-US"/>
+          </w:rPr>
+          <w:t>CBqVbm</w:t>
+        </w:r>
+        <w:r>
+          <w:rPr>
+            <w:rStyle w:val="Hyperlink"/>
+          </w:rPr>
+          <w:t>6</w:t>
+        </w:r>
+        <w:r>
+          <w:rPr>
+            <w:rStyle w:val="Hyperlink"/>
+            <w:lang w:val="en-US"/>
+          </w:rPr>
+          <w:t>f</w:t>
+        </w:r>
+      </w:hyperlink>
+    </w:p>
+    <w:p>
+      <w:pPr>
+        <w:rPr>
+          <w:lang w:val="en-US"/>
+        </w:rPr>
+      </w:pPr>
     </w:p>
     <w:p>
       <w:pPr>
         <w:pStyle w:val="Heading2"/>
+        <w:ind w:firstLine="567"/>
       </w:pPr>
       <w:bookmarkStart w:id="10" w:name="_Toc240548561"/>
       <w:r>
@@ -6116,40 +6505,65 @@
     </w:p>
     <w:p>
       <w:pPr>
-        <w:pStyle w:val="Placeholder"/>
-      </w:pPr>
-      <w:r>
-        <w:t>[Ссылка на репозиторий GitHub: ]</w:t>
-      </w:r>
-    </w:p>
-    <w:p>
-      <w:pPr>
         <w:pStyle w:val="Heading2"/>
+        <w:ind w:firstLine="567"/>
+        <w:rPr>
+          <w:lang w:val="en-US"/>
+        </w:rPr>
       </w:pPr>
       <w:bookmarkStart w:id="11" w:name="_Toc240548562"/>
-      <w:r>
+    </w:p>
+    <w:p>
+      <w:pPr>
+        <w:pStyle w:val="Heading2"/>
+        <w:ind w:firstLine="567"/>
+      </w:pPr>
+      <w:r>
+        <w:t>Список использованных источников</w:t>
+      </w:r>
+      <w:bookmarkEnd w:id="11"/>
+      <w:r>
+        <w:t xml:space="preserve"> </w:t>
+      </w:r>
+    </w:p>
+    <w:p>
+      <w:r>
+        <w:t>1. Docker Documentation [Электронный ресурс]. — URL: https://docs.docker.com/ (дата обращения: 17.09.2026).</w:t>
+      </w:r>
+    </w:p>
+    <w:p>
+      <w:pPr>
+        <w:rPr>
+          <w:lang w:val="en-US"/>
+        </w:rPr>
+      </w:pPr>
+      <w:r>
+        <w:rPr>
+          <w:lang w:val="en-US"/>
+        </w:rPr>
         <w:lastRenderedPageBreak/>
-        <w:t>Список использованных источников</w:t>
-      </w:r>
-      <w:bookmarkEnd w:id="11"/>
-      <w:r>
+        <w:t>2. Developing inside a Container // Visual Studio Code Documentation [</w:t>
+      </w:r>
+      <w:r>
+        <w:t>Электронный</w:t>
+      </w:r>
+      <w:r>
+        <w:rPr>
+          <w:lang w:val="en-US"/>
+        </w:rPr>
         <w:t xml:space="preserve"> </w:t>
       </w:r>
-    </w:p>
-    <w:p>
-      <w:r>
-        <w:t>1. Docker Documentation [Электронный ресурс]. — URL: https://docs.docker.com/ (дата обращения: 17.09.2026).</w:t>
-      </w:r>
-    </w:p>
-    <w:p>
-      <w:r>
-        <w:rPr>
-          <w:lang w:val="en-US"/>
-        </w:rPr>
-        <w:t>2. Developing inside a Container // Visual Studio Code Documentation [</w:t>
-      </w:r>
-      <w:r>
-        <w:t>Электронный</w:t>
+      <w:r>
+        <w:t>ресурс</w:t>
+      </w:r>
+      <w:r>
+        <w:rPr>
+          <w:lang w:val="en-US"/>
+        </w:rPr>
+        <w:t>]. — URL: https://code.visualstudio.com/docs/devcontainers/containers (</w:t>
+      </w:r>
+      <w:r>
+        <w:t>дата</w:t>
       </w:r>
       <w:r>
         <w:rPr>
@@ -6158,24 +6572,6 @@
         <w:t xml:space="preserve"> </w:t>
       </w:r>
       <w:r>
-        <w:t>ресурс</w:t>
-      </w:r>
-      <w:r>
-        <w:rPr>
-          <w:lang w:val="en-US"/>
-        </w:rPr>
-        <w:t>]. — URL: https://code.visualstudio.com/docs/devcontainers/containers (</w:t>
-      </w:r>
-      <w:r>
-        <w:t>дата</w:t>
-      </w:r>
-      <w:r>
-        <w:rPr>
-          <w:lang w:val="en-US"/>
-        </w:rPr>
-        <w:t xml:space="preserve"> </w:t>
-      </w:r>
-      <w:r>
         <w:t>обращения</w:t>
       </w:r>
       <w:r>
@@ -6186,8 +6582,8 @@
       </w:r>
     </w:p>
     <w:sectPr>
-      <w:headerReference w:type="default" r:id="rId18"/>
-      <w:footerReference w:type="default" r:id="rId19"/>
+      <w:headerReference w:type="default" r:id="rId20"/>
+      <w:footerReference w:type="default" r:id="rId21"/>
       <w:pgSz w:w="11900" w:h="16840"/>
       <w:pgMar w:top="1134" w:right="850" w:bottom="1134" w:left="1701" w:header="708" w:footer="422" w:gutter="0"/>
       <w:pgNumType w:start="2"/>
@@ -7056,6 +7452,7 @@
   <w:style w:type="paragraph" w:styleId="Heading2">
     <w:name w:val="heading 2"/>
     <w:next w:val="Normal"/>
+    <w:link w:val="Heading2Char"/>
     <w:uiPriority w:val="9"/>
     <w:unhideWhenUsed/>
     <w:qFormat/>
@@ -7269,6 +7666,47 @@
       <w:spacing w:after="100"/>
       <w:ind w:left="480"/>
     </w:pPr>
+  </w:style>
+  <w:style w:type="character" w:customStyle="1" w:styleId="Heading2Char">
+    <w:name w:val="Heading 2 Char"/>
+    <w:basedOn w:val="DefaultParagraphFont"/>
+    <w:link w:val="Heading2"/>
+    <w:uiPriority w:val="9"/>
+    <w:rsid w:val="00B66D4F"/>
+    <w:rPr>
+      <w:rFonts w:cs="Arial Unicode MS"/>
+      <w:b/>
+      <w:bCs/>
+      <w:color w:val="000000"/>
+      <w:sz w:val="24"/>
+      <w:szCs w:val="24"/>
+      <w:u w:color="000000"/>
+      <w:lang w:val="ru-RU"/>
+    </w:rPr>
+  </w:style>
+  <w:style w:type="character" w:styleId="UnresolvedMention">
+    <w:name w:val="Unresolved Mention"/>
+    <w:basedOn w:val="DefaultParagraphFont"/>
+    <w:uiPriority w:val="99"/>
+    <w:semiHidden/>
+    <w:unhideWhenUsed/>
+    <w:rsid w:val="00BD676E"/>
+    <w:rPr>
+      <w:color w:val="605E5C"/>
+      <w:shd w:val="clear" w:color="auto" w:fill="E1DFDD"/>
+    </w:rPr>
+  </w:style>
+  <w:style w:type="character" w:styleId="FollowedHyperlink">
+    <w:name w:val="FollowedHyperlink"/>
+    <w:basedOn w:val="DefaultParagraphFont"/>
+    <w:uiPriority w:val="99"/>
+    <w:semiHidden/>
+    <w:unhideWhenUsed/>
+    <w:rsid w:val="00BD676E"/>
+    <w:rPr>
+      <w:color w:val="FF00FF" w:themeColor="followedHyperlink"/>
+      <w:u w:val="single"/>
+    </w:rPr>
   </w:style>
 </w:styles>
 </file>

</xml_diff>

<commit_message>
add source code link to the report
</commit_message>
<xml_diff>
--- a/Отчет лабораторная 1.docx
+++ b/Отчет лабораторная 1.docx
@@ -5489,6 +5489,9 @@
     <w:p>
       <w:pPr>
         <w:pStyle w:val="Placeholder"/>
+        <w:rPr>
+          <w:lang w:val="en-US"/>
+        </w:rPr>
       </w:pPr>
       <w:r>
         <w:rPr>
@@ -6503,22 +6506,222 @@
       </w:r>
       <w:bookmarkEnd w:id="10"/>
     </w:p>
+    <w:bookmarkStart w:id="11" w:name="_Toc240548562"/>
+    <w:p>
+      <w:pPr>
+        <w:rPr>
+          <w:rStyle w:val="Hyperlink"/>
+        </w:rPr>
+      </w:pPr>
+      <w:r>
+        <w:rPr>
+          <w:rStyle w:val="Hyperlink"/>
+        </w:rPr>
+        <w:fldChar w:fldCharType="begin"/>
+      </w:r>
+      <w:r>
+        <w:rPr>
+          <w:rStyle w:val="Hyperlink"/>
+        </w:rPr>
+        <w:instrText>HYPERLINK "</w:instrText>
+      </w:r>
+      <w:r>
+        <w:rPr>
+          <w:rStyle w:val="Hyperlink"/>
+          <w:lang w:val="en-US"/>
+        </w:rPr>
+        <w:instrText>https</w:instrText>
+      </w:r>
+      <w:r>
+        <w:rPr>
+          <w:rStyle w:val="Hyperlink"/>
+        </w:rPr>
+        <w:instrText>://</w:instrText>
+      </w:r>
+      <w:r>
+        <w:rPr>
+          <w:rStyle w:val="Hyperlink"/>
+          <w:lang w:val="en-US"/>
+        </w:rPr>
+        <w:instrText>github</w:instrText>
+      </w:r>
+      <w:r>
+        <w:rPr>
+          <w:rStyle w:val="Hyperlink"/>
+        </w:rPr>
+        <w:instrText>.</w:instrText>
+      </w:r>
+      <w:r>
+        <w:rPr>
+          <w:rStyle w:val="Hyperlink"/>
+          <w:lang w:val="en-US"/>
+        </w:rPr>
+        <w:instrText>com</w:instrText>
+      </w:r>
+      <w:r>
+        <w:rPr>
+          <w:rStyle w:val="Hyperlink"/>
+        </w:rPr>
+        <w:instrText>/</w:instrText>
+      </w:r>
+      <w:r>
+        <w:rPr>
+          <w:rStyle w:val="Hyperlink"/>
+          <w:lang w:val="en-US"/>
+        </w:rPr>
+        <w:instrText>dylorone</w:instrText>
+      </w:r>
+      <w:r>
+        <w:rPr>
+          <w:rStyle w:val="Hyperlink"/>
+        </w:rPr>
+        <w:instrText>/</w:instrText>
+      </w:r>
+      <w:r>
+        <w:rPr>
+          <w:rStyle w:val="Hyperlink"/>
+          <w:lang w:val="en-US"/>
+        </w:rPr>
+        <w:instrText>avs</w:instrText>
+      </w:r>
+      <w:r>
+        <w:rPr>
+          <w:rStyle w:val="Hyperlink"/>
+        </w:rPr>
+        <w:instrText>_</w:instrText>
+      </w:r>
+      <w:r>
+        <w:rPr>
+          <w:rStyle w:val="Hyperlink"/>
+          <w:lang w:val="en-US"/>
+        </w:rPr>
+        <w:instrText>lab</w:instrText>
+      </w:r>
+      <w:r>
+        <w:rPr>
+          <w:rStyle w:val="Hyperlink"/>
+        </w:rPr>
+        <w:instrText>1_</w:instrText>
+      </w:r>
+      <w:r>
+        <w:rPr>
+          <w:rStyle w:val="Hyperlink"/>
+          <w:lang w:val="en-US"/>
+        </w:rPr>
+        <w:instrText>source</w:instrText>
+      </w:r>
+      <w:r>
+        <w:rPr>
+          <w:rStyle w:val="Hyperlink"/>
+        </w:rPr>
+        <w:instrText>"</w:instrText>
+      </w:r>
+      <w:r>
+        <w:rPr>
+          <w:rStyle w:val="Hyperlink"/>
+        </w:rPr>
+        <w:fldChar w:fldCharType="separate"/>
+      </w:r>
+      <w:r>
+        <w:rPr>
+          <w:rStyle w:val="Hyperlink"/>
+          <w:lang w:val="en-US"/>
+        </w:rPr>
+        <w:t>https</w:t>
+      </w:r>
+      <w:r>
+        <w:rPr>
+          <w:rStyle w:val="Hyperlink"/>
+        </w:rPr>
+        <w:t>://</w:t>
+      </w:r>
+      <w:r>
+        <w:rPr>
+          <w:rStyle w:val="Hyperlink"/>
+          <w:lang w:val="en-US"/>
+        </w:rPr>
+        <w:t>github</w:t>
+      </w:r>
+      <w:r>
+        <w:rPr>
+          <w:rStyle w:val="Hyperlink"/>
+        </w:rPr>
+        <w:t>.</w:t>
+      </w:r>
+      <w:r>
+        <w:rPr>
+          <w:rStyle w:val="Hyperlink"/>
+          <w:lang w:val="en-US"/>
+        </w:rPr>
+        <w:t>com</w:t>
+      </w:r>
+      <w:r>
+        <w:rPr>
+          <w:rStyle w:val="Hyperlink"/>
+        </w:rPr>
+        <w:t>/</w:t>
+      </w:r>
+      <w:r>
+        <w:rPr>
+          <w:rStyle w:val="Hyperlink"/>
+          <w:lang w:val="en-US"/>
+        </w:rPr>
+        <w:t>dylorone</w:t>
+      </w:r>
+      <w:r>
+        <w:rPr>
+          <w:rStyle w:val="Hyperlink"/>
+        </w:rPr>
+        <w:t>/</w:t>
+      </w:r>
+      <w:r>
+        <w:rPr>
+          <w:rStyle w:val="Hyperlink"/>
+          <w:lang w:val="en-US"/>
+        </w:rPr>
+        <w:t>avs</w:t>
+      </w:r>
+      <w:r>
+        <w:rPr>
+          <w:rStyle w:val="Hyperlink"/>
+        </w:rPr>
+        <w:t>_</w:t>
+      </w:r>
+      <w:r>
+        <w:rPr>
+          <w:rStyle w:val="Hyperlink"/>
+          <w:lang w:val="en-US"/>
+        </w:rPr>
+        <w:t>lab</w:t>
+      </w:r>
+      <w:r>
+        <w:rPr>
+          <w:rStyle w:val="Hyperlink"/>
+        </w:rPr>
+        <w:t>1_</w:t>
+      </w:r>
+      <w:r>
+        <w:rPr>
+          <w:rStyle w:val="Hyperlink"/>
+          <w:lang w:val="en-US"/>
+        </w:rPr>
+        <w:t>source</w:t>
+      </w:r>
+      <w:r>
+        <w:rPr>
+          <w:rStyle w:val="Hyperlink"/>
+        </w:rPr>
+        <w:fldChar w:fldCharType="end"/>
+      </w:r>
+    </w:p>
+    <w:p/>
     <w:p>
       <w:pPr>
         <w:pStyle w:val="Heading2"/>
         <w:ind w:firstLine="567"/>
-        <w:rPr>
-          <w:lang w:val="en-US"/>
-        </w:rPr>
-      </w:pPr>
-      <w:bookmarkStart w:id="11" w:name="_Toc240548562"/>
-    </w:p>
-    <w:p>
-      <w:pPr>
-        <w:pStyle w:val="Heading2"/>
-        <w:ind w:firstLine="567"/>
-      </w:pPr>
-      <w:r>
+      </w:pPr>
+      <w:r>
+        <w:lastRenderedPageBreak/>
         <w:t>Список использованных источников</w:t>
       </w:r>
       <w:bookmarkEnd w:id="11"/>
@@ -6541,7 +6744,6 @@
         <w:rPr>
           <w:lang w:val="en-US"/>
         </w:rPr>
-        <w:lastRenderedPageBreak/>
         <w:t>2. Developing inside a Container // Visual Studio Code Documentation [</w:t>
       </w:r>
       <w:r>

</xml_diff>

<commit_message>
add resulting repo link
</commit_message>
<xml_diff>
--- a/Отчет лабораторная 1.docx
+++ b/Отчет лабораторная 1.docx
@@ -272,42 +272,12 @@
           <w:cols w:space="720"/>
         </w:sectPr>
       </w:pPr>
-      <w:proofErr w:type="spellStart"/>
-      <w:r>
-        <w:rPr>
-          <w:lang w:val="en-US"/>
-        </w:rPr>
-        <w:t>Пивоварова</w:t>
-      </w:r>
-      <w:proofErr w:type="spellEnd"/>
-      <w:r>
-        <w:rPr>
-          <w:lang w:val="en-US"/>
-        </w:rPr>
-        <w:t xml:space="preserve"> </w:t>
-      </w:r>
-      <w:proofErr w:type="spellStart"/>
-      <w:r>
-        <w:rPr>
-          <w:lang w:val="en-US"/>
-        </w:rPr>
-        <w:t>Анастасия</w:t>
-      </w:r>
-      <w:proofErr w:type="spellEnd"/>
-      <w:r>
-        <w:rPr>
-          <w:lang w:val="en-US"/>
-        </w:rPr>
-        <w:t xml:space="preserve"> </w:t>
-      </w:r>
-      <w:proofErr w:type="spellStart"/>
-      <w:r>
-        <w:rPr>
-          <w:lang w:val="en-US"/>
-        </w:rPr>
-        <w:t>Алексеевна</w:t>
-      </w:r>
-      <w:proofErr w:type="spellEnd"/>
+      <w:r>
+        <w:rPr>
+          <w:lang w:val="en-US"/>
+        </w:rPr>
+        <w:t>Пивоварова Анастасия Алексеевна</w:t>
+      </w:r>
     </w:p>
     <w:p>
       <w:r>
@@ -1307,15 +1277,7 @@
     </w:p>
     <w:p>
       <w:r>
-        <w:t>Ниже приведены команды из исполняемого скрипта lab0.sh (</w:t>
-      </w:r>
-      <w:proofErr w:type="spellStart"/>
-      <w:r>
-        <w:t>find_file</w:t>
-      </w:r>
-      <w:proofErr w:type="spellEnd"/>
-      <w:r>
-        <w:t xml:space="preserve"> </w:t>
+        <w:t xml:space="preserve">Ниже приведены команды из исполняемого скрипта lab0.sh (find_file </w:t>
       </w:r>
       <w:r>
         <w:t xml:space="preserve">– </w:t>
@@ -1363,23 +1325,7 @@
         <w:rPr>
           <w:lang w:val="en-US"/>
         </w:rPr>
-        <w:t xml:space="preserve">git config --global </w:t>
-      </w:r>
-      <w:proofErr w:type="spellStart"/>
-      <w:proofErr w:type="gramStart"/>
-      <w:r>
-        <w:rPr>
-          <w:lang w:val="en-US"/>
-        </w:rPr>
-        <w:t>advice.defaultBranchName</w:t>
-      </w:r>
-      <w:proofErr w:type="spellEnd"/>
-      <w:proofErr w:type="gramEnd"/>
-      <w:r>
-        <w:rPr>
-          <w:lang w:val="en-US"/>
-        </w:rPr>
-        <w:t xml:space="preserve"> false</w:t>
+        <w:t>git config --global advice.defaultBranchName false</w:t>
       </w:r>
       <w:r>
         <w:rPr>
@@ -1405,20 +1351,7 @@
           <w:lang w:val="en-US"/>
         </w:rPr>
         <w:br/>
-      </w:r>
-      <w:proofErr w:type="spellStart"/>
-      <w:r>
-        <w:rPr>
-          <w:lang w:val="en-US"/>
-        </w:rPr>
-        <w:t>find_file</w:t>
-      </w:r>
-      <w:proofErr w:type="spellEnd"/>
-      <w:r>
-        <w:rPr>
-          <w:lang w:val="en-US"/>
-        </w:rPr>
-        <w:t>() {</w:t>
+        <w:t>find_file() {</w:t>
       </w:r>
       <w:r>
         <w:rPr>
@@ -1445,36 +1378,15 @@
           <w:lang w:val="en-US"/>
         </w:rPr>
         <w:br/>
-      </w:r>
-      <w:proofErr w:type="spellStart"/>
-      <w:r>
-        <w:rPr>
-          <w:lang w:val="en-US"/>
-        </w:rPr>
-        <w:t>mkdir</w:t>
-      </w:r>
-      <w:proofErr w:type="spellEnd"/>
-      <w:r>
-        <w:rPr>
-          <w:lang w:val="en-US"/>
-        </w:rPr>
-        <w:t xml:space="preserve"> lab0; cd lab0</w:t>
-      </w:r>
-      <w:r>
-        <w:rPr>
-          <w:lang w:val="en-US"/>
-        </w:rPr>
-        <w:br/>
-        <w:t xml:space="preserve">git </w:t>
-      </w:r>
-      <w:proofErr w:type="spellStart"/>
-      <w:r>
-        <w:rPr>
-          <w:lang w:val="en-US"/>
-        </w:rPr>
-        <w:t>init</w:t>
-      </w:r>
-      <w:proofErr w:type="spellEnd"/>
+        <w:t>mkdir lab0; cd lab0</w:t>
+      </w:r>
+      <w:r>
+        <w:rPr>
+          <w:lang w:val="en-US"/>
+        </w:rPr>
+        <w:br/>
+        <w:t>git init</w:t>
+      </w:r>
     </w:p>
     <w:p>
       <w:pPr>
@@ -1496,161 +1408,47 @@
           <w:lang w:val="en-US"/>
         </w:rPr>
       </w:pPr>
-      <w:proofErr w:type="spellStart"/>
-      <w:r>
-        <w:rPr>
-          <w:lang w:val="en-US"/>
-        </w:rPr>
-        <w:t>mkdir</w:t>
-      </w:r>
-      <w:proofErr w:type="spellEnd"/>
-      <w:r>
-        <w:rPr>
-          <w:lang w:val="en-US"/>
-        </w:rPr>
-        <w:t xml:space="preserve"> -p </w:t>
-      </w:r>
-      <w:proofErr w:type="spellStart"/>
-      <w:r>
-        <w:rPr>
-          <w:lang w:val="en-US"/>
-        </w:rPr>
-        <w:t>claude_monet</w:t>
-      </w:r>
-      <w:proofErr w:type="spellEnd"/>
-      <w:r>
-        <w:rPr>
-          <w:lang w:val="en-US"/>
-        </w:rPr>
-        <w:t>/kitchen/</w:t>
-      </w:r>
-      <w:proofErr w:type="spellStart"/>
-      <w:r>
-        <w:rPr>
-          <w:lang w:val="en-US"/>
-        </w:rPr>
-        <w:t>morning_shift</w:t>
-      </w:r>
-      <w:proofErr w:type="spellEnd"/>
-      <w:r>
-        <w:rPr>
-          <w:lang w:val="en-US"/>
-        </w:rPr>
-        <w:t xml:space="preserve"> \</w:t>
-      </w:r>
-      <w:r>
-        <w:rPr>
-          <w:lang w:val="en-US"/>
-        </w:rPr>
-        <w:br/>
-        <w:t xml:space="preserve">         </w:t>
-      </w:r>
-      <w:proofErr w:type="spellStart"/>
-      <w:r>
-        <w:rPr>
-          <w:lang w:val="en-US"/>
-        </w:rPr>
-        <w:t>claude_monet</w:t>
-      </w:r>
-      <w:proofErr w:type="spellEnd"/>
-      <w:r>
-        <w:rPr>
-          <w:lang w:val="en-US"/>
-        </w:rPr>
-        <w:t>/kitchen/</w:t>
-      </w:r>
-      <w:proofErr w:type="spellStart"/>
-      <w:r>
-        <w:rPr>
-          <w:lang w:val="en-US"/>
-        </w:rPr>
-        <w:t>evening_shift</w:t>
-      </w:r>
-      <w:proofErr w:type="spellEnd"/>
-      <w:r>
-        <w:rPr>
-          <w:lang w:val="en-US"/>
-        </w:rPr>
-        <w:t xml:space="preserve"> \</w:t>
-      </w:r>
-      <w:r>
-        <w:rPr>
-          <w:lang w:val="en-US"/>
-        </w:rPr>
-        <w:br/>
-        <w:t xml:space="preserve">         </w:t>
-      </w:r>
-      <w:proofErr w:type="spellStart"/>
-      <w:r>
-        <w:rPr>
-          <w:lang w:val="en-US"/>
-        </w:rPr>
-        <w:t>claude_monet</w:t>
-      </w:r>
-      <w:proofErr w:type="spellEnd"/>
-      <w:r>
-        <w:rPr>
-          <w:lang w:val="en-US"/>
-        </w:rPr>
-        <w:t>/hall \</w:t>
-      </w:r>
-      <w:r>
-        <w:rPr>
-          <w:lang w:val="en-US"/>
-        </w:rPr>
-        <w:br/>
-        <w:t xml:space="preserve">         </w:t>
-      </w:r>
-      <w:proofErr w:type="spellStart"/>
-      <w:r>
-        <w:rPr>
-          <w:lang w:val="en-US"/>
-        </w:rPr>
-        <w:t>claude_monet</w:t>
-      </w:r>
-      <w:proofErr w:type="spellEnd"/>
-      <w:r>
-        <w:rPr>
-          <w:lang w:val="en-US"/>
-        </w:rPr>
-        <w:t>/office \</w:t>
-      </w:r>
-      <w:r>
-        <w:rPr>
-          <w:lang w:val="en-US"/>
-        </w:rPr>
-        <w:br/>
-        <w:t xml:space="preserve">         </w:t>
-      </w:r>
-      <w:proofErr w:type="spellStart"/>
-      <w:r>
-        <w:rPr>
-          <w:lang w:val="en-US"/>
-        </w:rPr>
-        <w:t>staff_room</w:t>
-      </w:r>
-      <w:proofErr w:type="spellEnd"/>
-      <w:r>
-        <w:rPr>
-          <w:lang w:val="en-US"/>
-        </w:rPr>
-        <w:t xml:space="preserve"> \</w:t>
-      </w:r>
-      <w:r>
-        <w:rPr>
-          <w:lang w:val="en-US"/>
-        </w:rPr>
-        <w:br/>
-        <w:t xml:space="preserve">         </w:t>
-      </w:r>
-      <w:proofErr w:type="spellStart"/>
-      <w:r>
-        <w:rPr>
-          <w:lang w:val="en-US"/>
-        </w:rPr>
-        <w:t>reserve_empty</w:t>
-      </w:r>
-      <w:proofErr w:type="spellEnd"/>
+      <w:r>
+        <w:rPr>
+          <w:lang w:val="en-US"/>
+        </w:rPr>
+        <w:t>mkdir -p claude_monet/kitchen/morning_shift \</w:t>
+      </w:r>
+      <w:r>
+        <w:rPr>
+          <w:lang w:val="en-US"/>
+        </w:rPr>
+        <w:br/>
+        <w:t xml:space="preserve">         claude_monet/kitchen/evening_shift \</w:t>
+      </w:r>
+      <w:r>
+        <w:rPr>
+          <w:lang w:val="en-US"/>
+        </w:rPr>
+        <w:br/>
+        <w:t xml:space="preserve">         claude_monet/hall \</w:t>
+      </w:r>
+      <w:r>
+        <w:rPr>
+          <w:lang w:val="en-US"/>
+        </w:rPr>
+        <w:br/>
+        <w:t xml:space="preserve">         claude_monet/office \</w:t>
+      </w:r>
+      <w:r>
+        <w:rPr>
+          <w:lang w:val="en-US"/>
+        </w:rPr>
+        <w:br/>
+        <w:t xml:space="preserve">         staff_room \</w:t>
+      </w:r>
+      <w:r>
+        <w:rPr>
+          <w:lang w:val="en-US"/>
+        </w:rPr>
+        <w:br/>
+        <w:t xml:space="preserve">         reserve_empty</w:t>
+      </w:r>
     </w:p>
     <w:p>
       <w:pPr>
@@ -1712,373 +1510,71 @@
         <w:rPr>
           <w:lang w:val="en-US"/>
         </w:rPr>
-        <w:t xml:space="preserve">touch </w:t>
-      </w:r>
-      <w:proofErr w:type="spellStart"/>
-      <w:r>
-        <w:rPr>
-          <w:lang w:val="en-US"/>
-        </w:rPr>
-        <w:t>claude_monet</w:t>
-      </w:r>
-      <w:proofErr w:type="spellEnd"/>
-      <w:r>
-        <w:rPr>
-          <w:lang w:val="en-US"/>
-        </w:rPr>
-        <w:t>/kitchen/</w:t>
-      </w:r>
-      <w:proofErr w:type="spellStart"/>
-      <w:r>
-        <w:rPr>
-          <w:lang w:val="en-US"/>
-        </w:rPr>
-        <w:t>morning_shift</w:t>
-      </w:r>
-      <w:proofErr w:type="spellEnd"/>
-      <w:r>
-        <w:rPr>
-          <w:lang w:val="en-US"/>
-        </w:rPr>
-        <w:t>/</w:t>
-      </w:r>
-      <w:proofErr w:type="spellStart"/>
-      <w:r>
-        <w:rPr>
-          <w:lang w:val="en-US"/>
-        </w:rPr>
-        <w:t>senya_tasks</w:t>
-      </w:r>
-      <w:proofErr w:type="spellEnd"/>
-      <w:r>
-        <w:rPr>
-          <w:lang w:val="en-US"/>
-        </w:rPr>
-        <w:t xml:space="preserve"> \</w:t>
-      </w:r>
-      <w:r>
-        <w:rPr>
-          <w:lang w:val="en-US"/>
-        </w:rPr>
-        <w:br/>
-        <w:t xml:space="preserve">      </w:t>
-      </w:r>
-      <w:proofErr w:type="spellStart"/>
-      <w:r>
-        <w:rPr>
-          <w:lang w:val="en-US"/>
-        </w:rPr>
-        <w:t>claude_monet</w:t>
-      </w:r>
-      <w:proofErr w:type="spellEnd"/>
-      <w:r>
-        <w:rPr>
-          <w:lang w:val="en-US"/>
-        </w:rPr>
-        <w:t>/kitchen/</w:t>
-      </w:r>
-      <w:proofErr w:type="spellStart"/>
-      <w:r>
-        <w:rPr>
-          <w:lang w:val="en-US"/>
-        </w:rPr>
-        <w:t>morning_shift</w:t>
-      </w:r>
-      <w:proofErr w:type="spellEnd"/>
-      <w:r>
-        <w:rPr>
-          <w:lang w:val="en-US"/>
-        </w:rPr>
-        <w:t>/</w:t>
-      </w:r>
-      <w:proofErr w:type="spellStart"/>
-      <w:r>
-        <w:rPr>
-          <w:lang w:val="en-US"/>
-        </w:rPr>
-        <w:t>fedya_tasks</w:t>
-      </w:r>
-      <w:proofErr w:type="spellEnd"/>
-      <w:r>
-        <w:rPr>
-          <w:lang w:val="en-US"/>
-        </w:rPr>
-        <w:t xml:space="preserve"> \</w:t>
-      </w:r>
-      <w:r>
-        <w:rPr>
-          <w:lang w:val="en-US"/>
-        </w:rPr>
-        <w:br/>
-        <w:t xml:space="preserve">      </w:t>
-      </w:r>
-      <w:proofErr w:type="spellStart"/>
-      <w:r>
-        <w:rPr>
-          <w:lang w:val="en-US"/>
-        </w:rPr>
-        <w:t>claude_monet</w:t>
-      </w:r>
-      <w:proofErr w:type="spellEnd"/>
-      <w:r>
-        <w:rPr>
-          <w:lang w:val="en-US"/>
-        </w:rPr>
-        <w:t>/kitchen/</w:t>
-      </w:r>
-      <w:proofErr w:type="spellStart"/>
-      <w:r>
-        <w:rPr>
-          <w:lang w:val="en-US"/>
-        </w:rPr>
-        <w:t>evening_shift</w:t>
-      </w:r>
-      <w:proofErr w:type="spellEnd"/>
-      <w:r>
-        <w:rPr>
-          <w:lang w:val="en-US"/>
-        </w:rPr>
-        <w:t>/</w:t>
-      </w:r>
-      <w:proofErr w:type="spellStart"/>
-      <w:r>
-        <w:rPr>
-          <w:lang w:val="en-US"/>
-        </w:rPr>
-        <w:t>max_tasks</w:t>
-      </w:r>
-      <w:proofErr w:type="spellEnd"/>
-      <w:r>
-        <w:rPr>
-          <w:lang w:val="en-US"/>
-        </w:rPr>
-        <w:t xml:space="preserve"> \</w:t>
-      </w:r>
-      <w:r>
-        <w:rPr>
-          <w:lang w:val="en-US"/>
-        </w:rPr>
-        <w:br/>
-        <w:t xml:space="preserve">      </w:t>
-      </w:r>
-      <w:proofErr w:type="spellStart"/>
-      <w:r>
-        <w:rPr>
-          <w:lang w:val="en-US"/>
-        </w:rPr>
-        <w:t>claude_monet</w:t>
-      </w:r>
-      <w:proofErr w:type="spellEnd"/>
-      <w:r>
-        <w:rPr>
-          <w:lang w:val="en-US"/>
-        </w:rPr>
-        <w:t>/kitchen/</w:t>
-      </w:r>
-      <w:proofErr w:type="spellStart"/>
-      <w:r>
-        <w:rPr>
-          <w:lang w:val="en-US"/>
-        </w:rPr>
-        <w:t>evening_shift</w:t>
-      </w:r>
-      <w:proofErr w:type="spellEnd"/>
-      <w:r>
-        <w:rPr>
-          <w:lang w:val="en-US"/>
-        </w:rPr>
-        <w:t>/</w:t>
-      </w:r>
-      <w:proofErr w:type="spellStart"/>
-      <w:r>
-        <w:rPr>
-          <w:lang w:val="en-US"/>
-        </w:rPr>
-        <w:t>denis_tasks</w:t>
-      </w:r>
-      <w:proofErr w:type="spellEnd"/>
-      <w:r>
-        <w:rPr>
-          <w:lang w:val="en-US"/>
-        </w:rPr>
-        <w:t xml:space="preserve"> \</w:t>
-      </w:r>
-      <w:r>
-        <w:rPr>
-          <w:lang w:val="en-US"/>
-        </w:rPr>
-        <w:br/>
-        <w:t xml:space="preserve">      </w:t>
-      </w:r>
-      <w:proofErr w:type="spellStart"/>
-      <w:r>
-        <w:rPr>
-          <w:lang w:val="en-US"/>
-        </w:rPr>
-        <w:t>claude_monet</w:t>
-      </w:r>
-      <w:proofErr w:type="spellEnd"/>
-      <w:r>
-        <w:rPr>
-          <w:lang w:val="en-US"/>
-        </w:rPr>
-        <w:t>/kitchen/</w:t>
-      </w:r>
-      <w:proofErr w:type="spellStart"/>
-      <w:r>
-        <w:rPr>
-          <w:lang w:val="en-US"/>
-        </w:rPr>
-        <w:t>leva_order</w:t>
-      </w:r>
-      <w:proofErr w:type="spellEnd"/>
-      <w:r>
-        <w:rPr>
-          <w:lang w:val="en-US"/>
-        </w:rPr>
-        <w:t xml:space="preserve"> \</w:t>
-      </w:r>
-      <w:r>
-        <w:rPr>
-          <w:lang w:val="en-US"/>
-        </w:rPr>
-        <w:br/>
-        <w:t xml:space="preserve">      </w:t>
-      </w:r>
-      <w:proofErr w:type="spellStart"/>
-      <w:r>
-        <w:rPr>
-          <w:lang w:val="en-US"/>
-        </w:rPr>
-        <w:t>claude_monet</w:t>
-      </w:r>
-      <w:proofErr w:type="spellEnd"/>
-      <w:r>
-        <w:rPr>
-          <w:lang w:val="en-US"/>
-        </w:rPr>
-        <w:t>/hall/</w:t>
-      </w:r>
-      <w:proofErr w:type="spellStart"/>
-      <w:r>
-        <w:rPr>
-          <w:lang w:val="en-US"/>
-        </w:rPr>
-        <w:t>table_plan</w:t>
-      </w:r>
-      <w:proofErr w:type="spellEnd"/>
-      <w:r>
-        <w:rPr>
-          <w:lang w:val="en-US"/>
-        </w:rPr>
-        <w:t xml:space="preserve"> \</w:t>
-      </w:r>
-      <w:r>
-        <w:rPr>
-          <w:lang w:val="en-US"/>
-        </w:rPr>
-        <w:br/>
-        <w:t xml:space="preserve">      </w:t>
-      </w:r>
-      <w:proofErr w:type="spellStart"/>
-      <w:r>
-        <w:rPr>
-          <w:lang w:val="en-US"/>
-        </w:rPr>
-        <w:t>claude_monet</w:t>
-      </w:r>
-      <w:proofErr w:type="spellEnd"/>
-      <w:r>
-        <w:rPr>
-          <w:lang w:val="en-US"/>
-        </w:rPr>
-        <w:t>/hall/complaints \</w:t>
-      </w:r>
-      <w:r>
-        <w:rPr>
-          <w:lang w:val="en-US"/>
-        </w:rPr>
-        <w:br/>
-        <w:t xml:space="preserve">      </w:t>
-      </w:r>
-      <w:proofErr w:type="spellStart"/>
-      <w:r>
-        <w:rPr>
-          <w:lang w:val="en-US"/>
-        </w:rPr>
-        <w:t>claude_monet</w:t>
-      </w:r>
-      <w:proofErr w:type="spellEnd"/>
-      <w:r>
-        <w:rPr>
-          <w:lang w:val="en-US"/>
-        </w:rPr>
-        <w:t>/office/</w:t>
-      </w:r>
-      <w:proofErr w:type="spellStart"/>
-      <w:r>
-        <w:rPr>
-          <w:lang w:val="en-US"/>
-        </w:rPr>
-        <w:t>barinov_schedule</w:t>
-      </w:r>
-      <w:proofErr w:type="spellEnd"/>
-      <w:r>
-        <w:rPr>
-          <w:lang w:val="en-US"/>
-        </w:rPr>
-        <w:t xml:space="preserve"> \</w:t>
-      </w:r>
-      <w:r>
-        <w:rPr>
-          <w:lang w:val="en-US"/>
-        </w:rPr>
-        <w:br/>
-        <w:t xml:space="preserve">      </w:t>
-      </w:r>
-      <w:proofErr w:type="spellStart"/>
-      <w:r>
-        <w:rPr>
-          <w:lang w:val="en-US"/>
-        </w:rPr>
-        <w:t>staff_room</w:t>
-      </w:r>
-      <w:proofErr w:type="spellEnd"/>
-      <w:r>
-        <w:rPr>
-          <w:lang w:val="en-US"/>
-        </w:rPr>
-        <w:t>/</w:t>
-      </w:r>
-      <w:proofErr w:type="spellStart"/>
-      <w:r>
-        <w:rPr>
-          <w:lang w:val="en-US"/>
-        </w:rPr>
-        <w:t>late_report</w:t>
-      </w:r>
-      <w:proofErr w:type="spellEnd"/>
-      <w:r>
-        <w:rPr>
-          <w:lang w:val="en-US"/>
-        </w:rPr>
-        <w:t xml:space="preserve"> \</w:t>
-      </w:r>
-      <w:r>
-        <w:rPr>
-          <w:lang w:val="en-US"/>
-        </w:rPr>
-        <w:br/>
-        <w:t xml:space="preserve">      </w:t>
-      </w:r>
-      <w:proofErr w:type="spellStart"/>
-      <w:r>
-        <w:rPr>
-          <w:lang w:val="en-US"/>
-        </w:rPr>
-        <w:t>shift_message</w:t>
-      </w:r>
-      <w:proofErr w:type="spellEnd"/>
+        <w:t>touch claude_monet/kitchen/morning_shift/senya_tasks \</w:t>
+      </w:r>
+      <w:r>
+        <w:rPr>
+          <w:lang w:val="en-US"/>
+        </w:rPr>
+        <w:br/>
+        <w:t xml:space="preserve">      claude_monet/kitchen/morning_shift/fedya_tasks \</w:t>
+      </w:r>
+      <w:r>
+        <w:rPr>
+          <w:lang w:val="en-US"/>
+        </w:rPr>
+        <w:br/>
+        <w:t xml:space="preserve">      claude_monet/kitchen/evening_shift/max_tasks \</w:t>
+      </w:r>
+      <w:r>
+        <w:rPr>
+          <w:lang w:val="en-US"/>
+        </w:rPr>
+        <w:br/>
+        <w:t xml:space="preserve">      claude_monet/kitchen/evening_shift/denis_tasks \</w:t>
+      </w:r>
+      <w:r>
+        <w:rPr>
+          <w:lang w:val="en-US"/>
+        </w:rPr>
+        <w:br/>
+        <w:t xml:space="preserve">      claude_monet/kitchen/leva_order \</w:t>
+      </w:r>
+      <w:r>
+        <w:rPr>
+          <w:lang w:val="en-US"/>
+        </w:rPr>
+        <w:br/>
+        <w:t xml:space="preserve">      claude_monet/hall/table_plan \</w:t>
+      </w:r>
+      <w:r>
+        <w:rPr>
+          <w:lang w:val="en-US"/>
+        </w:rPr>
+        <w:br/>
+        <w:t xml:space="preserve">      claude_monet/hall/complaints \</w:t>
+      </w:r>
+      <w:r>
+        <w:rPr>
+          <w:lang w:val="en-US"/>
+        </w:rPr>
+        <w:br/>
+        <w:t xml:space="preserve">      claude_monet/office/barinov_schedule \</w:t>
+      </w:r>
+      <w:r>
+        <w:rPr>
+          <w:lang w:val="en-US"/>
+        </w:rPr>
+        <w:br/>
+        <w:t xml:space="preserve">      staff_room/late_report \</w:t>
+      </w:r>
+      <w:r>
+        <w:rPr>
+          <w:lang w:val="en-US"/>
+        </w:rPr>
+        <w:br/>
+        <w:t xml:space="preserve">      shift_message</w:t>
+      </w:r>
     </w:p>
     <w:p>
       <w:pPr>
@@ -2333,35 +1829,7 @@
         <w:rPr>
           <w:lang w:val="en-US"/>
         </w:rPr>
-        <w:t>cat &lt;&lt;EOF &gt; $(</w:t>
-      </w:r>
-      <w:proofErr w:type="spellStart"/>
-      <w:r>
-        <w:rPr>
-          <w:lang w:val="en-US"/>
-        </w:rPr>
-        <w:t>find_file</w:t>
-      </w:r>
-      <w:proofErr w:type="spellEnd"/>
-      <w:r>
-        <w:rPr>
-          <w:lang w:val="en-US"/>
-        </w:rPr>
-        <w:t xml:space="preserve"> '</w:t>
-      </w:r>
-      <w:proofErr w:type="spellStart"/>
-      <w:r>
-        <w:rPr>
-          <w:lang w:val="en-US"/>
-        </w:rPr>
-        <w:t>late_report</w:t>
-      </w:r>
-      <w:proofErr w:type="spellEnd"/>
-      <w:r>
-        <w:rPr>
-          <w:lang w:val="en-US"/>
-        </w:rPr>
-        <w:t>')</w:t>
+        <w:t>cat &lt;&lt;EOF &gt; $(find_file 'late_report')</w:t>
       </w:r>
       <w:r>
         <w:rPr>
@@ -2498,16 +1966,8 @@
           <w:lang w:val="en-US"/>
         </w:rPr>
         <w:br/>
-        <w:t xml:space="preserve">git </w:t>
-      </w:r>
-      <w:proofErr w:type="gramStart"/>
-      <w:r>
-        <w:rPr>
-          <w:lang w:val="en-US"/>
-        </w:rPr>
-        <w:t>add .</w:t>
-      </w:r>
-      <w:proofErr w:type="gramEnd"/>
+        <w:t>git add .</w:t>
+      </w:r>
       <w:r>
         <w:rPr>
           <w:lang w:val="en-US"/>
@@ -2595,1074 +2055,136 @@
           <w:lang w:val="en-US"/>
         </w:rPr>
       </w:pPr>
-      <w:proofErr w:type="spellStart"/>
-      <w:r>
-        <w:rPr>
-          <w:lang w:val="en-US"/>
-        </w:rPr>
-        <w:t>chmod</w:t>
-      </w:r>
-      <w:proofErr w:type="spellEnd"/>
-      <w:r>
-        <w:rPr>
-          <w:lang w:val="en-US"/>
-        </w:rPr>
-        <w:t xml:space="preserve"> 755 $(</w:t>
-      </w:r>
-      <w:proofErr w:type="spellStart"/>
-      <w:r>
-        <w:rPr>
-          <w:lang w:val="en-US"/>
-        </w:rPr>
-        <w:t>find_file</w:t>
-      </w:r>
-      <w:proofErr w:type="spellEnd"/>
-      <w:r>
-        <w:rPr>
-          <w:lang w:val="en-US"/>
-        </w:rPr>
-        <w:t xml:space="preserve"> '</w:t>
-      </w:r>
-      <w:proofErr w:type="spellStart"/>
-      <w:r>
-        <w:rPr>
-          <w:lang w:val="en-US"/>
-        </w:rPr>
-        <w:t>claude_monet</w:t>
-      </w:r>
-      <w:proofErr w:type="spellEnd"/>
-      <w:r>
-        <w:rPr>
-          <w:lang w:val="en-US"/>
-        </w:rPr>
-        <w:t>')</w:t>
-      </w:r>
-      <w:r>
-        <w:rPr>
-          <w:lang w:val="en-US"/>
-        </w:rPr>
-        <w:br/>
-      </w:r>
-      <w:proofErr w:type="spellStart"/>
-      <w:r>
-        <w:rPr>
-          <w:lang w:val="en-US"/>
-        </w:rPr>
-        <w:t>chmod</w:t>
-      </w:r>
-      <w:proofErr w:type="spellEnd"/>
-      <w:r>
-        <w:rPr>
-          <w:lang w:val="en-US"/>
-        </w:rPr>
-        <w:t xml:space="preserve"> u=</w:t>
-      </w:r>
-      <w:proofErr w:type="spellStart"/>
-      <w:r>
-        <w:rPr>
-          <w:lang w:val="en-US"/>
-        </w:rPr>
-        <w:t>rwx,g</w:t>
-      </w:r>
-      <w:proofErr w:type="spellEnd"/>
-      <w:r>
-        <w:rPr>
-          <w:lang w:val="en-US"/>
-        </w:rPr>
-        <w:t>=</w:t>
-      </w:r>
-      <w:proofErr w:type="spellStart"/>
-      <w:r>
-        <w:rPr>
-          <w:lang w:val="en-US"/>
-        </w:rPr>
-        <w:t>rx,o</w:t>
-      </w:r>
-      <w:proofErr w:type="spellEnd"/>
-      <w:r>
-        <w:rPr>
-          <w:lang w:val="en-US"/>
-        </w:rPr>
-        <w:t>=--- $(</w:t>
-      </w:r>
-      <w:proofErr w:type="spellStart"/>
-      <w:r>
-        <w:rPr>
-          <w:lang w:val="en-US"/>
-        </w:rPr>
-        <w:t>find_file</w:t>
-      </w:r>
-      <w:proofErr w:type="spellEnd"/>
-      <w:r>
-        <w:rPr>
-          <w:lang w:val="en-US"/>
-        </w:rPr>
-        <w:t xml:space="preserve"> 'kitchen')</w:t>
-      </w:r>
-      <w:r>
-        <w:rPr>
-          <w:lang w:val="en-US"/>
-        </w:rPr>
-        <w:br/>
-      </w:r>
-      <w:proofErr w:type="spellStart"/>
-      <w:r>
-        <w:rPr>
-          <w:lang w:val="en-US"/>
-        </w:rPr>
-        <w:t>chmod</w:t>
-      </w:r>
-      <w:proofErr w:type="spellEnd"/>
-      <w:r>
-        <w:rPr>
-          <w:lang w:val="en-US"/>
-        </w:rPr>
-        <w:t xml:space="preserve"> 750 $(</w:t>
-      </w:r>
-      <w:proofErr w:type="spellStart"/>
-      <w:r>
-        <w:rPr>
-          <w:lang w:val="en-US"/>
-        </w:rPr>
-        <w:t>find_file</w:t>
-      </w:r>
-      <w:proofErr w:type="spellEnd"/>
-      <w:r>
-        <w:rPr>
-          <w:lang w:val="en-US"/>
-        </w:rPr>
-        <w:t xml:space="preserve"> '</w:t>
-      </w:r>
-      <w:proofErr w:type="spellStart"/>
-      <w:r>
-        <w:rPr>
-          <w:lang w:val="en-US"/>
-        </w:rPr>
-        <w:t>morning_shift</w:t>
-      </w:r>
-      <w:proofErr w:type="spellEnd"/>
-      <w:r>
-        <w:rPr>
-          <w:lang w:val="en-US"/>
-        </w:rPr>
-        <w:t>')</w:t>
-      </w:r>
-      <w:r>
-        <w:rPr>
-          <w:lang w:val="en-US"/>
-        </w:rPr>
-        <w:br/>
-      </w:r>
-      <w:proofErr w:type="spellStart"/>
-      <w:r>
-        <w:rPr>
-          <w:lang w:val="en-US"/>
-        </w:rPr>
-        <w:t>chmod</w:t>
-      </w:r>
-      <w:proofErr w:type="spellEnd"/>
-      <w:r>
-        <w:rPr>
-          <w:lang w:val="en-US"/>
-        </w:rPr>
-        <w:t xml:space="preserve"> u=</w:t>
-      </w:r>
-      <w:proofErr w:type="spellStart"/>
-      <w:r>
-        <w:rPr>
-          <w:lang w:val="en-US"/>
-        </w:rPr>
-        <w:t>rw,g</w:t>
-      </w:r>
-      <w:proofErr w:type="spellEnd"/>
-      <w:r>
-        <w:rPr>
-          <w:lang w:val="en-US"/>
-        </w:rPr>
-        <w:t>=</w:t>
-      </w:r>
-      <w:proofErr w:type="spellStart"/>
-      <w:r>
-        <w:rPr>
-          <w:lang w:val="en-US"/>
-        </w:rPr>
-        <w:t>r,o</w:t>
-      </w:r>
-      <w:proofErr w:type="spellEnd"/>
-      <w:r>
-        <w:rPr>
-          <w:lang w:val="en-US"/>
-        </w:rPr>
-        <w:t>=--- $(</w:t>
-      </w:r>
-      <w:proofErr w:type="spellStart"/>
-      <w:r>
-        <w:rPr>
-          <w:lang w:val="en-US"/>
-        </w:rPr>
-        <w:t>find_file</w:t>
-      </w:r>
-      <w:proofErr w:type="spellEnd"/>
-      <w:r>
-        <w:rPr>
-          <w:lang w:val="en-US"/>
-        </w:rPr>
-        <w:t xml:space="preserve"> '</w:t>
-      </w:r>
-      <w:proofErr w:type="spellStart"/>
-      <w:r>
-        <w:rPr>
-          <w:lang w:val="en-US"/>
-        </w:rPr>
-        <w:t>senya_tasks</w:t>
-      </w:r>
-      <w:proofErr w:type="spellEnd"/>
-      <w:r>
-        <w:rPr>
-          <w:lang w:val="en-US"/>
-        </w:rPr>
-        <w:t>')</w:t>
-      </w:r>
-      <w:r>
-        <w:rPr>
-          <w:lang w:val="en-US"/>
-        </w:rPr>
-        <w:br/>
-      </w:r>
-      <w:proofErr w:type="spellStart"/>
-      <w:r>
-        <w:rPr>
-          <w:lang w:val="en-US"/>
-        </w:rPr>
-        <w:t>chmod</w:t>
-      </w:r>
-      <w:proofErr w:type="spellEnd"/>
-      <w:r>
-        <w:rPr>
-          <w:lang w:val="en-US"/>
-        </w:rPr>
-        <w:t xml:space="preserve"> 640 $(</w:t>
-      </w:r>
-      <w:proofErr w:type="spellStart"/>
-      <w:r>
-        <w:rPr>
-          <w:lang w:val="en-US"/>
-        </w:rPr>
-        <w:t>find_file</w:t>
-      </w:r>
-      <w:proofErr w:type="spellEnd"/>
-      <w:r>
-        <w:rPr>
-          <w:lang w:val="en-US"/>
-        </w:rPr>
-        <w:t xml:space="preserve"> '</w:t>
-      </w:r>
-      <w:proofErr w:type="spellStart"/>
-      <w:r>
-        <w:rPr>
-          <w:lang w:val="en-US"/>
-        </w:rPr>
-        <w:t>fedya_tasks</w:t>
-      </w:r>
-      <w:proofErr w:type="spellEnd"/>
-      <w:r>
-        <w:rPr>
-          <w:lang w:val="en-US"/>
-        </w:rPr>
-        <w:t>')</w:t>
-      </w:r>
-      <w:r>
-        <w:rPr>
-          <w:lang w:val="en-US"/>
-        </w:rPr>
-        <w:br/>
-      </w:r>
-      <w:proofErr w:type="spellStart"/>
-      <w:r>
-        <w:rPr>
-          <w:lang w:val="en-US"/>
-        </w:rPr>
-        <w:t>chmod</w:t>
-      </w:r>
-      <w:proofErr w:type="spellEnd"/>
-      <w:r>
-        <w:rPr>
-          <w:lang w:val="en-US"/>
-        </w:rPr>
-        <w:t xml:space="preserve"> u=</w:t>
-      </w:r>
-      <w:proofErr w:type="spellStart"/>
-      <w:r>
-        <w:rPr>
-          <w:lang w:val="en-US"/>
-        </w:rPr>
-        <w:t>rwx,g</w:t>
-      </w:r>
-      <w:proofErr w:type="spellEnd"/>
-      <w:r>
-        <w:rPr>
-          <w:lang w:val="en-US"/>
-        </w:rPr>
-        <w:t>=</w:t>
-      </w:r>
-      <w:proofErr w:type="spellStart"/>
-      <w:r>
-        <w:rPr>
-          <w:lang w:val="en-US"/>
-        </w:rPr>
-        <w:t>rx,o</w:t>
-      </w:r>
-      <w:proofErr w:type="spellEnd"/>
-      <w:r>
-        <w:rPr>
-          <w:lang w:val="en-US"/>
-        </w:rPr>
-        <w:t>=--- $(</w:t>
-      </w:r>
-      <w:proofErr w:type="spellStart"/>
-      <w:r>
-        <w:rPr>
-          <w:lang w:val="en-US"/>
-        </w:rPr>
-        <w:t>find_file</w:t>
-      </w:r>
-      <w:proofErr w:type="spellEnd"/>
-      <w:r>
-        <w:rPr>
-          <w:lang w:val="en-US"/>
-        </w:rPr>
-        <w:t xml:space="preserve"> '</w:t>
-      </w:r>
-      <w:proofErr w:type="spellStart"/>
-      <w:r>
-        <w:rPr>
-          <w:lang w:val="en-US"/>
-        </w:rPr>
-        <w:t>evening_shift</w:t>
-      </w:r>
-      <w:proofErr w:type="spellEnd"/>
-      <w:r>
-        <w:rPr>
-          <w:lang w:val="en-US"/>
-        </w:rPr>
-        <w:t>')</w:t>
-      </w:r>
-      <w:r>
-        <w:rPr>
-          <w:lang w:val="en-US"/>
-        </w:rPr>
-        <w:br/>
-      </w:r>
-      <w:proofErr w:type="spellStart"/>
-      <w:r>
-        <w:rPr>
-          <w:lang w:val="en-US"/>
-        </w:rPr>
-        <w:t>chmod</w:t>
-      </w:r>
-      <w:proofErr w:type="spellEnd"/>
-      <w:r>
-        <w:rPr>
-          <w:lang w:val="en-US"/>
-        </w:rPr>
-        <w:t xml:space="preserve"> 644 $(</w:t>
-      </w:r>
-      <w:proofErr w:type="spellStart"/>
-      <w:r>
-        <w:rPr>
-          <w:lang w:val="en-US"/>
-        </w:rPr>
-        <w:t>find_file</w:t>
-      </w:r>
-      <w:proofErr w:type="spellEnd"/>
-      <w:r>
-        <w:rPr>
-          <w:lang w:val="en-US"/>
-        </w:rPr>
-        <w:t xml:space="preserve"> '</w:t>
-      </w:r>
-      <w:proofErr w:type="spellStart"/>
-      <w:r>
-        <w:rPr>
-          <w:lang w:val="en-US"/>
-        </w:rPr>
-        <w:t>max_tasks</w:t>
-      </w:r>
-      <w:proofErr w:type="spellEnd"/>
-      <w:r>
-        <w:rPr>
-          <w:lang w:val="en-US"/>
-        </w:rPr>
-        <w:t>')</w:t>
-      </w:r>
-      <w:r>
-        <w:rPr>
-          <w:lang w:val="en-US"/>
-        </w:rPr>
-        <w:br/>
-      </w:r>
-      <w:proofErr w:type="spellStart"/>
-      <w:r>
-        <w:rPr>
-          <w:lang w:val="en-US"/>
-        </w:rPr>
-        <w:t>chmod</w:t>
-      </w:r>
-      <w:proofErr w:type="spellEnd"/>
-      <w:r>
-        <w:rPr>
-          <w:lang w:val="en-US"/>
-        </w:rPr>
-        <w:t xml:space="preserve"> u=</w:t>
-      </w:r>
-      <w:proofErr w:type="spellStart"/>
-      <w:r>
-        <w:rPr>
-          <w:lang w:val="en-US"/>
-        </w:rPr>
-        <w:t>rw,g</w:t>
-      </w:r>
-      <w:proofErr w:type="spellEnd"/>
-      <w:r>
-        <w:rPr>
-          <w:lang w:val="en-US"/>
-        </w:rPr>
-        <w:t>=</w:t>
-      </w:r>
-      <w:proofErr w:type="spellStart"/>
-      <w:r>
-        <w:rPr>
-          <w:lang w:val="en-US"/>
-        </w:rPr>
-        <w:t>r,o</w:t>
-      </w:r>
-      <w:proofErr w:type="spellEnd"/>
-      <w:r>
-        <w:rPr>
-          <w:lang w:val="en-US"/>
-        </w:rPr>
-        <w:t>=r $(</w:t>
-      </w:r>
-      <w:proofErr w:type="spellStart"/>
-      <w:r>
-        <w:rPr>
-          <w:lang w:val="en-US"/>
-        </w:rPr>
-        <w:t>find_file</w:t>
-      </w:r>
-      <w:proofErr w:type="spellEnd"/>
-      <w:r>
-        <w:rPr>
-          <w:lang w:val="en-US"/>
-        </w:rPr>
-        <w:t xml:space="preserve"> '</w:t>
-      </w:r>
-      <w:proofErr w:type="spellStart"/>
-      <w:r>
-        <w:rPr>
-          <w:lang w:val="en-US"/>
-        </w:rPr>
-        <w:t>denis_tasks</w:t>
-      </w:r>
-      <w:proofErr w:type="spellEnd"/>
-      <w:r>
-        <w:rPr>
-          <w:lang w:val="en-US"/>
-        </w:rPr>
-        <w:t>')</w:t>
-      </w:r>
-      <w:r>
-        <w:rPr>
-          <w:lang w:val="en-US"/>
-        </w:rPr>
-        <w:br/>
-      </w:r>
-      <w:proofErr w:type="spellStart"/>
-      <w:r>
-        <w:rPr>
-          <w:lang w:val="en-US"/>
-        </w:rPr>
-        <w:t>chmod</w:t>
-      </w:r>
-      <w:proofErr w:type="spellEnd"/>
-      <w:r>
-        <w:rPr>
-          <w:lang w:val="en-US"/>
-        </w:rPr>
-        <w:t xml:space="preserve"> 660 $(</w:t>
-      </w:r>
-      <w:proofErr w:type="spellStart"/>
-      <w:r>
-        <w:rPr>
-          <w:lang w:val="en-US"/>
-        </w:rPr>
-        <w:t>find_file</w:t>
-      </w:r>
-      <w:proofErr w:type="spellEnd"/>
-      <w:r>
-        <w:rPr>
-          <w:lang w:val="en-US"/>
-        </w:rPr>
-        <w:t xml:space="preserve"> '</w:t>
-      </w:r>
-      <w:proofErr w:type="spellStart"/>
-      <w:r>
-        <w:rPr>
-          <w:lang w:val="en-US"/>
-        </w:rPr>
-        <w:t>leva_order</w:t>
-      </w:r>
-      <w:proofErr w:type="spellEnd"/>
-      <w:r>
-        <w:rPr>
-          <w:lang w:val="en-US"/>
-        </w:rPr>
-        <w:t>')</w:t>
-      </w:r>
-      <w:r>
-        <w:rPr>
-          <w:lang w:val="en-US"/>
-        </w:rPr>
-        <w:br/>
-      </w:r>
-      <w:proofErr w:type="spellStart"/>
-      <w:r>
-        <w:rPr>
-          <w:lang w:val="en-US"/>
-        </w:rPr>
-        <w:t>chmod</w:t>
-      </w:r>
-      <w:proofErr w:type="spellEnd"/>
-      <w:r>
-        <w:rPr>
-          <w:lang w:val="en-US"/>
-        </w:rPr>
-        <w:t xml:space="preserve"> u=</w:t>
-      </w:r>
-      <w:proofErr w:type="spellStart"/>
-      <w:r>
-        <w:rPr>
-          <w:lang w:val="en-US"/>
-        </w:rPr>
-        <w:t>rwx,g</w:t>
-      </w:r>
-      <w:proofErr w:type="spellEnd"/>
-      <w:r>
-        <w:rPr>
-          <w:lang w:val="en-US"/>
-        </w:rPr>
-        <w:t>=</w:t>
-      </w:r>
-      <w:proofErr w:type="spellStart"/>
-      <w:r>
-        <w:rPr>
-          <w:lang w:val="en-US"/>
-        </w:rPr>
-        <w:t>rx,o</w:t>
-      </w:r>
-      <w:proofErr w:type="spellEnd"/>
-      <w:r>
-        <w:rPr>
-          <w:lang w:val="en-US"/>
-        </w:rPr>
-        <w:t>=</w:t>
-      </w:r>
-      <w:proofErr w:type="spellStart"/>
-      <w:r>
-        <w:rPr>
-          <w:lang w:val="en-US"/>
-        </w:rPr>
-        <w:t>rx</w:t>
-      </w:r>
-      <w:proofErr w:type="spellEnd"/>
-      <w:r>
-        <w:rPr>
-          <w:lang w:val="en-US"/>
-        </w:rPr>
-        <w:t xml:space="preserve"> $(</w:t>
-      </w:r>
-      <w:proofErr w:type="spellStart"/>
-      <w:r>
-        <w:rPr>
-          <w:lang w:val="en-US"/>
-        </w:rPr>
-        <w:t>find_file</w:t>
-      </w:r>
-      <w:proofErr w:type="spellEnd"/>
-      <w:r>
-        <w:rPr>
-          <w:lang w:val="en-US"/>
-        </w:rPr>
-        <w:t xml:space="preserve"> 'hall')</w:t>
-      </w:r>
-      <w:r>
-        <w:rPr>
-          <w:lang w:val="en-US"/>
-        </w:rPr>
-        <w:br/>
-      </w:r>
-      <w:proofErr w:type="spellStart"/>
-      <w:r>
-        <w:rPr>
-          <w:lang w:val="en-US"/>
-        </w:rPr>
-        <w:t>chmod</w:t>
-      </w:r>
-      <w:proofErr w:type="spellEnd"/>
-      <w:r>
-        <w:rPr>
-          <w:lang w:val="en-US"/>
-        </w:rPr>
-        <w:t xml:space="preserve"> 644 $(</w:t>
-      </w:r>
-      <w:proofErr w:type="spellStart"/>
-      <w:r>
-        <w:rPr>
-          <w:lang w:val="en-US"/>
-        </w:rPr>
-        <w:t>find_file</w:t>
-      </w:r>
-      <w:proofErr w:type="spellEnd"/>
-      <w:r>
-        <w:rPr>
-          <w:lang w:val="en-US"/>
-        </w:rPr>
-        <w:t xml:space="preserve"> '</w:t>
-      </w:r>
-      <w:proofErr w:type="spellStart"/>
-      <w:r>
-        <w:rPr>
-          <w:lang w:val="en-US"/>
-        </w:rPr>
-        <w:t>table_plan</w:t>
-      </w:r>
-      <w:proofErr w:type="spellEnd"/>
-      <w:r>
-        <w:rPr>
-          <w:lang w:val="en-US"/>
-        </w:rPr>
-        <w:t>')</w:t>
-      </w:r>
-      <w:r>
-        <w:rPr>
-          <w:lang w:val="en-US"/>
-        </w:rPr>
-        <w:br/>
-      </w:r>
-      <w:proofErr w:type="spellStart"/>
-      <w:r>
-        <w:rPr>
-          <w:lang w:val="en-US"/>
-        </w:rPr>
-        <w:t>chmod</w:t>
-      </w:r>
-      <w:proofErr w:type="spellEnd"/>
-      <w:r>
-        <w:rPr>
-          <w:lang w:val="en-US"/>
-        </w:rPr>
-        <w:t xml:space="preserve"> u=</w:t>
-      </w:r>
-      <w:proofErr w:type="spellStart"/>
-      <w:r>
-        <w:rPr>
-          <w:lang w:val="en-US"/>
-        </w:rPr>
-        <w:t>rw,g</w:t>
-      </w:r>
-      <w:proofErr w:type="spellEnd"/>
-      <w:r>
-        <w:rPr>
-          <w:lang w:val="en-US"/>
-        </w:rPr>
-        <w:t>=</w:t>
-      </w:r>
-      <w:proofErr w:type="spellStart"/>
-      <w:r>
-        <w:rPr>
-          <w:lang w:val="en-US"/>
-        </w:rPr>
-        <w:t>rw,o</w:t>
-      </w:r>
-      <w:proofErr w:type="spellEnd"/>
-      <w:r>
-        <w:rPr>
-          <w:lang w:val="en-US"/>
-        </w:rPr>
-        <w:t>=r $(</w:t>
-      </w:r>
-      <w:proofErr w:type="spellStart"/>
-      <w:r>
-        <w:rPr>
-          <w:lang w:val="en-US"/>
-        </w:rPr>
-        <w:t>find_file</w:t>
-      </w:r>
-      <w:proofErr w:type="spellEnd"/>
-      <w:r>
-        <w:rPr>
-          <w:lang w:val="en-US"/>
-        </w:rPr>
-        <w:t xml:space="preserve"> 'complaints')</w:t>
-      </w:r>
-      <w:r>
-        <w:rPr>
-          <w:lang w:val="en-US"/>
-        </w:rPr>
-        <w:br/>
-      </w:r>
-      <w:proofErr w:type="spellStart"/>
-      <w:r>
-        <w:rPr>
-          <w:lang w:val="en-US"/>
-        </w:rPr>
-        <w:t>chmod</w:t>
-      </w:r>
-      <w:proofErr w:type="spellEnd"/>
-      <w:r>
-        <w:rPr>
-          <w:lang w:val="en-US"/>
-        </w:rPr>
-        <w:t xml:space="preserve"> 750 $(</w:t>
-      </w:r>
-      <w:proofErr w:type="spellStart"/>
-      <w:r>
-        <w:rPr>
-          <w:lang w:val="en-US"/>
-        </w:rPr>
-        <w:t>find_file</w:t>
-      </w:r>
-      <w:proofErr w:type="spellEnd"/>
-      <w:r>
-        <w:rPr>
-          <w:lang w:val="en-US"/>
-        </w:rPr>
-        <w:t xml:space="preserve"> 'office')</w:t>
-      </w:r>
-      <w:r>
-        <w:rPr>
-          <w:lang w:val="en-US"/>
-        </w:rPr>
-        <w:br/>
-      </w:r>
-      <w:proofErr w:type="spellStart"/>
-      <w:r>
-        <w:rPr>
-          <w:lang w:val="en-US"/>
-        </w:rPr>
-        <w:t>chmod</w:t>
-      </w:r>
-      <w:proofErr w:type="spellEnd"/>
-      <w:r>
-        <w:rPr>
-          <w:lang w:val="en-US"/>
-        </w:rPr>
-        <w:t xml:space="preserve"> u=</w:t>
-      </w:r>
-      <w:proofErr w:type="spellStart"/>
-      <w:r>
-        <w:rPr>
-          <w:lang w:val="en-US"/>
-        </w:rPr>
-        <w:t>rw,g</w:t>
-      </w:r>
-      <w:proofErr w:type="spellEnd"/>
-      <w:r>
-        <w:rPr>
-          <w:lang w:val="en-US"/>
-        </w:rPr>
-        <w:t>=</w:t>
-      </w:r>
-      <w:proofErr w:type="spellStart"/>
-      <w:r>
-        <w:rPr>
-          <w:lang w:val="en-US"/>
-        </w:rPr>
-        <w:t>r,o</w:t>
-      </w:r>
-      <w:proofErr w:type="spellEnd"/>
-      <w:r>
-        <w:rPr>
-          <w:lang w:val="en-US"/>
-        </w:rPr>
-        <w:t>=--- $(</w:t>
-      </w:r>
-      <w:proofErr w:type="spellStart"/>
-      <w:r>
-        <w:rPr>
-          <w:lang w:val="en-US"/>
-        </w:rPr>
-        <w:t>find_file</w:t>
-      </w:r>
-      <w:proofErr w:type="spellEnd"/>
-      <w:r>
-        <w:rPr>
-          <w:lang w:val="en-US"/>
-        </w:rPr>
-        <w:t xml:space="preserve"> '</w:t>
-      </w:r>
-      <w:proofErr w:type="spellStart"/>
-      <w:r>
-        <w:rPr>
-          <w:lang w:val="en-US"/>
-        </w:rPr>
-        <w:t>barinov_schedule</w:t>
-      </w:r>
-      <w:proofErr w:type="spellEnd"/>
-      <w:r>
-        <w:rPr>
-          <w:lang w:val="en-US"/>
-        </w:rPr>
-        <w:t>')</w:t>
-      </w:r>
-      <w:r>
-        <w:rPr>
-          <w:lang w:val="en-US"/>
-        </w:rPr>
-        <w:br/>
-      </w:r>
-      <w:proofErr w:type="spellStart"/>
-      <w:r>
-        <w:rPr>
-          <w:lang w:val="en-US"/>
-        </w:rPr>
-        <w:t>chmod</w:t>
-      </w:r>
-      <w:proofErr w:type="spellEnd"/>
-      <w:r>
-        <w:rPr>
-          <w:lang w:val="en-US"/>
-        </w:rPr>
-        <w:t xml:space="preserve"> u=</w:t>
-      </w:r>
-      <w:proofErr w:type="spellStart"/>
-      <w:r>
-        <w:rPr>
-          <w:lang w:val="en-US"/>
-        </w:rPr>
-        <w:t>rwx,g</w:t>
-      </w:r>
-      <w:proofErr w:type="spellEnd"/>
-      <w:r>
-        <w:rPr>
-          <w:lang w:val="en-US"/>
-        </w:rPr>
-        <w:t>=</w:t>
-      </w:r>
-      <w:proofErr w:type="spellStart"/>
-      <w:r>
-        <w:rPr>
-          <w:lang w:val="en-US"/>
-        </w:rPr>
-        <w:t>rx,o</w:t>
-      </w:r>
-      <w:proofErr w:type="spellEnd"/>
-      <w:r>
-        <w:rPr>
-          <w:lang w:val="en-US"/>
-        </w:rPr>
-        <w:t>=--- $(</w:t>
-      </w:r>
-      <w:proofErr w:type="spellStart"/>
-      <w:r>
-        <w:rPr>
-          <w:lang w:val="en-US"/>
-        </w:rPr>
-        <w:t>find_file</w:t>
-      </w:r>
-      <w:proofErr w:type="spellEnd"/>
-      <w:r>
-        <w:rPr>
-          <w:lang w:val="en-US"/>
-        </w:rPr>
-        <w:t xml:space="preserve"> '</w:t>
-      </w:r>
-      <w:proofErr w:type="spellStart"/>
-      <w:r>
-        <w:rPr>
-          <w:lang w:val="en-US"/>
-        </w:rPr>
-        <w:t>staff_room</w:t>
-      </w:r>
-      <w:proofErr w:type="spellEnd"/>
-      <w:r>
-        <w:rPr>
-          <w:lang w:val="en-US"/>
-        </w:rPr>
-        <w:t>')</w:t>
-      </w:r>
-      <w:r>
-        <w:rPr>
-          <w:lang w:val="en-US"/>
-        </w:rPr>
-        <w:br/>
-      </w:r>
-      <w:proofErr w:type="spellStart"/>
+      <w:r>
+        <w:rPr>
+          <w:lang w:val="en-US"/>
+        </w:rPr>
+        <w:t>chmod 755 $(find_file 'claude_monet')</w:t>
+      </w:r>
+      <w:r>
+        <w:rPr>
+          <w:lang w:val="en-US"/>
+        </w:rPr>
+        <w:br/>
+        <w:t>chmod u=rwx,g=rx,o=--- $(find_file 'kitchen')</w:t>
+      </w:r>
+      <w:r>
+        <w:rPr>
+          <w:lang w:val="en-US"/>
+        </w:rPr>
+        <w:br/>
+        <w:t>chmod 750 $(find_file 'morning_shift')</w:t>
+      </w:r>
+      <w:r>
+        <w:rPr>
+          <w:lang w:val="en-US"/>
+        </w:rPr>
+        <w:br/>
+        <w:t>chmod u=rw,g=r,o=--- $(find_file 'senya_tasks')</w:t>
+      </w:r>
+      <w:r>
+        <w:rPr>
+          <w:lang w:val="en-US"/>
+        </w:rPr>
+        <w:br/>
+        <w:t>chmod 640 $(find_file 'fedya_tasks')</w:t>
+      </w:r>
+      <w:r>
+        <w:rPr>
+          <w:lang w:val="en-US"/>
+        </w:rPr>
+        <w:br/>
+        <w:t>chmod u=rwx,g=rx,o=--- $(find_file 'evening_shift')</w:t>
+      </w:r>
+      <w:r>
+        <w:rPr>
+          <w:lang w:val="en-US"/>
+        </w:rPr>
+        <w:br/>
+        <w:t>chmod 644 $(find_file 'max_tasks')</w:t>
+      </w:r>
+      <w:r>
+        <w:rPr>
+          <w:lang w:val="en-US"/>
+        </w:rPr>
+        <w:br/>
+        <w:t>chmod u=rw,g=r,o=r $(find_file 'denis_tasks')</w:t>
+      </w:r>
+      <w:r>
+        <w:rPr>
+          <w:lang w:val="en-US"/>
+        </w:rPr>
+        <w:br/>
+        <w:t>chmod 660 $(find_file 'leva_order')</w:t>
+      </w:r>
+      <w:r>
+        <w:rPr>
+          <w:lang w:val="en-US"/>
+        </w:rPr>
+        <w:br/>
+        <w:t>chmod u=rwx,g=rx,o=rx $(find_file 'hall')</w:t>
+      </w:r>
+      <w:r>
+        <w:rPr>
+          <w:lang w:val="en-US"/>
+        </w:rPr>
+        <w:br/>
+        <w:t>chmod 644 $(find_file 'table_plan')</w:t>
+      </w:r>
+      <w:r>
+        <w:rPr>
+          <w:lang w:val="en-US"/>
+        </w:rPr>
+        <w:br/>
+        <w:t>chmod u=rw,g=rw,o=r $(find_file 'complaints')</w:t>
+      </w:r>
+      <w:r>
+        <w:rPr>
+          <w:lang w:val="en-US"/>
+        </w:rPr>
+        <w:br/>
+        <w:t>chmod 750 $(find_file 'office')</w:t>
+      </w:r>
+      <w:r>
+        <w:rPr>
+          <w:lang w:val="en-US"/>
+        </w:rPr>
+        <w:br/>
+        <w:t>chmod u=rw,g=r,o=--- $(find_file 'barinov_schedule')</w:t>
+      </w:r>
+      <w:r>
+        <w:rPr>
+          <w:lang w:val="en-US"/>
+        </w:rPr>
+        <w:br/>
+        <w:t>chmod u=rwx,g=rx,o=--- $(find_file 'staff_room')</w:t>
+      </w:r>
+      <w:r>
+        <w:rPr>
+          <w:lang w:val="en-US"/>
+        </w:rPr>
+        <w:br/>
+      </w:r>
       <w:r>
         <w:rPr>
           <w:lang w:val="en-US"/>
         </w:rPr>
         <w:lastRenderedPageBreak/>
-        <w:t>chmod</w:t>
-      </w:r>
-      <w:proofErr w:type="spellEnd"/>
-      <w:r>
-        <w:rPr>
-          <w:lang w:val="en-US"/>
-        </w:rPr>
-        <w:t xml:space="preserve"> 640 $(</w:t>
-      </w:r>
-      <w:proofErr w:type="spellStart"/>
-      <w:r>
-        <w:rPr>
-          <w:lang w:val="en-US"/>
-        </w:rPr>
-        <w:t>find_file</w:t>
-      </w:r>
-      <w:proofErr w:type="spellEnd"/>
-      <w:r>
-        <w:rPr>
-          <w:lang w:val="en-US"/>
-        </w:rPr>
-        <w:t xml:space="preserve"> '</w:t>
-      </w:r>
-      <w:proofErr w:type="spellStart"/>
-      <w:r>
-        <w:rPr>
-          <w:lang w:val="en-US"/>
-        </w:rPr>
-        <w:t>late_report</w:t>
-      </w:r>
-      <w:proofErr w:type="spellEnd"/>
-      <w:r>
-        <w:rPr>
-          <w:lang w:val="en-US"/>
-        </w:rPr>
-        <w:t>')</w:t>
-      </w:r>
-      <w:r>
-        <w:rPr>
-          <w:lang w:val="en-US"/>
-        </w:rPr>
-        <w:br/>
-      </w:r>
-      <w:proofErr w:type="spellStart"/>
-      <w:r>
-        <w:rPr>
-          <w:lang w:val="en-US"/>
-        </w:rPr>
-        <w:t>chmod</w:t>
-      </w:r>
-      <w:proofErr w:type="spellEnd"/>
-      <w:r>
-        <w:rPr>
-          <w:lang w:val="en-US"/>
-        </w:rPr>
-        <w:t xml:space="preserve"> 700 $(</w:t>
-      </w:r>
-      <w:proofErr w:type="spellStart"/>
-      <w:r>
-        <w:rPr>
-          <w:lang w:val="en-US"/>
-        </w:rPr>
-        <w:t>find_file</w:t>
-      </w:r>
-      <w:proofErr w:type="spellEnd"/>
-      <w:r>
-        <w:rPr>
-          <w:lang w:val="en-US"/>
-        </w:rPr>
-        <w:t xml:space="preserve"> '</w:t>
-      </w:r>
-      <w:proofErr w:type="spellStart"/>
-      <w:r>
-        <w:rPr>
-          <w:lang w:val="en-US"/>
-        </w:rPr>
-        <w:t>reserve_empty</w:t>
-      </w:r>
-      <w:proofErr w:type="spellEnd"/>
-      <w:r>
-        <w:rPr>
-          <w:lang w:val="en-US"/>
-        </w:rPr>
-        <w:t>')</w:t>
-      </w:r>
-      <w:r>
-        <w:rPr>
-          <w:lang w:val="en-US"/>
-        </w:rPr>
-        <w:br/>
-      </w:r>
-      <w:proofErr w:type="spellStart"/>
-      <w:r>
-        <w:rPr>
-          <w:lang w:val="en-US"/>
-        </w:rPr>
-        <w:t>chmod</w:t>
-      </w:r>
-      <w:proofErr w:type="spellEnd"/>
-      <w:r>
-        <w:rPr>
-          <w:lang w:val="en-US"/>
-        </w:rPr>
-        <w:t xml:space="preserve"> u=</w:t>
-      </w:r>
-      <w:proofErr w:type="spellStart"/>
-      <w:r>
-        <w:rPr>
-          <w:lang w:val="en-US"/>
-        </w:rPr>
-        <w:t>rw,g</w:t>
-      </w:r>
-      <w:proofErr w:type="spellEnd"/>
-      <w:r>
-        <w:rPr>
-          <w:lang w:val="en-US"/>
-        </w:rPr>
-        <w:t>=</w:t>
-      </w:r>
-      <w:proofErr w:type="spellStart"/>
-      <w:r>
-        <w:rPr>
-          <w:lang w:val="en-US"/>
-        </w:rPr>
-        <w:t>r,o</w:t>
-      </w:r>
-      <w:proofErr w:type="spellEnd"/>
-      <w:r>
-        <w:rPr>
-          <w:lang w:val="en-US"/>
-        </w:rPr>
-        <w:t>=r $(</w:t>
-      </w:r>
-      <w:proofErr w:type="spellStart"/>
-      <w:r>
-        <w:rPr>
-          <w:lang w:val="en-US"/>
-        </w:rPr>
-        <w:t>find_file</w:t>
-      </w:r>
-      <w:proofErr w:type="spellEnd"/>
-      <w:r>
-        <w:rPr>
-          <w:lang w:val="en-US"/>
-        </w:rPr>
-        <w:t xml:space="preserve"> '</w:t>
-      </w:r>
-      <w:proofErr w:type="spellStart"/>
-      <w:r>
-        <w:rPr>
-          <w:lang w:val="en-US"/>
-        </w:rPr>
-        <w:t>shift_message</w:t>
-      </w:r>
-      <w:proofErr w:type="spellEnd"/>
-      <w:r>
-        <w:rPr>
-          <w:lang w:val="en-US"/>
-        </w:rPr>
-        <w:t>')</w:t>
+        <w:t>chmod 640 $(find_file 'late_report')</w:t>
+      </w:r>
+      <w:r>
+        <w:rPr>
+          <w:lang w:val="en-US"/>
+        </w:rPr>
+        <w:br/>
+        <w:t>chmod 700 $(find_file 'reserve_empty')</w:t>
+      </w:r>
+      <w:r>
+        <w:rPr>
+          <w:lang w:val="en-US"/>
+        </w:rPr>
+        <w:br/>
+        <w:t>chmod u=rw,g=r,o=r $(find_file 'shift_message')</w:t>
       </w:r>
     </w:p>
     <w:p>
@@ -3773,16 +2295,8 @@
           <w:lang w:val="en-US"/>
         </w:rPr>
         <w:br/>
-        <w:t xml:space="preserve">git </w:t>
-      </w:r>
-      <w:proofErr w:type="gramStart"/>
-      <w:r>
-        <w:rPr>
-          <w:lang w:val="en-US"/>
-        </w:rPr>
-        <w:t>add .</w:t>
-      </w:r>
-      <w:proofErr w:type="gramEnd"/>
+        <w:t>git add .</w:t>
+      </w:r>
       <w:r>
         <w:rPr>
           <w:lang w:val="en-US"/>
@@ -3847,133 +2361,13 @@
     </w:p>
     <w:p>
       <w:r>
-        <w:t xml:space="preserve">cp копирует late_report в office/discipline_report и рекурсивно morning_shift в morning_backup; ln -s создаёт символические ссылки </w:t>
-      </w:r>
-      <w:proofErr w:type="spellStart"/>
-      <w:r>
-        <w:t>current_order</w:t>
-      </w:r>
-      <w:proofErr w:type="spellEnd"/>
-      <w:r>
-        <w:t xml:space="preserve"> и </w:t>
-      </w:r>
-      <w:proofErr w:type="spellStart"/>
-      <w:r>
-        <w:t>shift_kitchen</w:t>
-      </w:r>
-      <w:proofErr w:type="spellEnd"/>
-      <w:r>
-        <w:t xml:space="preserve">, </w:t>
-      </w:r>
-      <w:proofErr w:type="spellStart"/>
-      <w:r>
-        <w:t>ln</w:t>
-      </w:r>
-      <w:proofErr w:type="spellEnd"/>
-      <w:r>
-        <w:t xml:space="preserve"> </w:t>
+        <w:t xml:space="preserve">cp копирует late_report в office/discipline_report и рекурсивно morning_shift в morning_backup; ln -s создаёт символические ссылки current_order и shift_kitchen, ln </w:t>
       </w:r>
       <w:r>
         <w:t>– ж</w:t>
       </w:r>
       <w:r>
-        <w:t xml:space="preserve">ёсткую </w:t>
-      </w:r>
-      <w:proofErr w:type="spellStart"/>
-      <w:r>
-        <w:t>common_message</w:t>
-      </w:r>
-      <w:proofErr w:type="spellEnd"/>
-      <w:r>
-        <w:t xml:space="preserve">; </w:t>
-      </w:r>
-      <w:proofErr w:type="spellStart"/>
-      <w:r>
-        <w:t>cat</w:t>
-      </w:r>
-      <w:proofErr w:type="spellEnd"/>
-      <w:r>
-        <w:t xml:space="preserve"> </w:t>
-      </w:r>
-      <w:proofErr w:type="gramStart"/>
-      <w:r>
-        <w:t>с &gt;</w:t>
-      </w:r>
-      <w:proofErr w:type="gramEnd"/>
-      <w:r>
-        <w:t xml:space="preserve"> объединяет </w:t>
-      </w:r>
-      <w:proofErr w:type="spellStart"/>
-      <w:r>
-        <w:t>senya_tasks</w:t>
-      </w:r>
-      <w:proofErr w:type="spellEnd"/>
-      <w:r>
-        <w:t xml:space="preserve"> и </w:t>
-      </w:r>
-      <w:proofErr w:type="spellStart"/>
-      <w:r>
-        <w:t>fedya_tasks</w:t>
-      </w:r>
-      <w:proofErr w:type="spellEnd"/>
-      <w:r>
-        <w:t xml:space="preserve"> в </w:t>
-      </w:r>
-      <w:proofErr w:type="spellStart"/>
-      <w:r>
-        <w:t>morning_report</w:t>
-      </w:r>
-      <w:proofErr w:type="spellEnd"/>
-      <w:r>
-        <w:t xml:space="preserve">, с &gt;&gt; дописывает </w:t>
-      </w:r>
-      <w:proofErr w:type="spellStart"/>
-      <w:r>
-        <w:t>barinov_schedule</w:t>
-      </w:r>
-      <w:proofErr w:type="spellEnd"/>
-      <w:r>
-        <w:t xml:space="preserve"> в </w:t>
-      </w:r>
-      <w:proofErr w:type="spellStart"/>
-      <w:r>
-        <w:t>leva_order</w:t>
-      </w:r>
-      <w:proofErr w:type="spellEnd"/>
-      <w:r>
-        <w:t xml:space="preserve">; </w:t>
-      </w:r>
-      <w:proofErr w:type="spellStart"/>
-      <w:r>
-        <w:t>mv</w:t>
-      </w:r>
-      <w:proofErr w:type="spellEnd"/>
-      <w:r>
-        <w:t xml:space="preserve"> переносит </w:t>
-      </w:r>
-      <w:proofErr w:type="spellStart"/>
-      <w:r>
-        <w:t>complaints</w:t>
-      </w:r>
-      <w:proofErr w:type="spellEnd"/>
-      <w:r>
-        <w:t xml:space="preserve"> в </w:t>
-      </w:r>
-      <w:proofErr w:type="spellStart"/>
-      <w:r>
-        <w:t>office</w:t>
-      </w:r>
-      <w:proofErr w:type="spellEnd"/>
-      <w:r>
-        <w:t>/</w:t>
-      </w:r>
-      <w:proofErr w:type="spellStart"/>
-      <w:r>
-        <w:t>guest_complaints</w:t>
-      </w:r>
-      <w:proofErr w:type="spellEnd"/>
-      <w:r>
-        <w:t>. Коммит «Third subtask» фиксирует изменения.</w:t>
+        <w:t>ёсткую common_message; cat с &gt; объединяет senya_tasks и fedya_tasks в morning_report, с &gt;&gt; дописывает barinov_schedule в leva_order; mv переносит complaints в office/guest_complaints. Коммит «Third subtask» фиксирует изменения.</w:t>
       </w:r>
     </w:p>
     <w:p>
@@ -4007,472 +2401,64 @@
           <w:lang w:val="en-US"/>
         </w:rPr>
         <w:br/>
-        <w:t xml:space="preserve">cp </w:t>
-      </w:r>
-      <w:proofErr w:type="spellStart"/>
-      <w:r>
-        <w:rPr>
-          <w:lang w:val="en-US"/>
-        </w:rPr>
-        <w:t>staff_room</w:t>
-      </w:r>
-      <w:proofErr w:type="spellEnd"/>
-      <w:r>
-        <w:rPr>
-          <w:lang w:val="en-US"/>
-        </w:rPr>
-        <w:t>/</w:t>
-      </w:r>
-      <w:proofErr w:type="spellStart"/>
-      <w:r>
-        <w:rPr>
-          <w:lang w:val="en-US"/>
-        </w:rPr>
-        <w:t>late_report</w:t>
-      </w:r>
-      <w:proofErr w:type="spellEnd"/>
-      <w:r>
-        <w:rPr>
-          <w:lang w:val="en-US"/>
-        </w:rPr>
-        <w:t xml:space="preserve"> </w:t>
-      </w:r>
-      <w:proofErr w:type="spellStart"/>
-      <w:r>
-        <w:rPr>
-          <w:lang w:val="en-US"/>
-        </w:rPr>
-        <w:t>claude_monet</w:t>
-      </w:r>
-      <w:proofErr w:type="spellEnd"/>
-      <w:r>
-        <w:rPr>
-          <w:lang w:val="en-US"/>
-        </w:rPr>
-        <w:t>/office/</w:t>
-      </w:r>
-      <w:proofErr w:type="spellStart"/>
-      <w:r>
-        <w:rPr>
-          <w:lang w:val="en-US"/>
-        </w:rPr>
-        <w:t>discipline_report</w:t>
-      </w:r>
-      <w:proofErr w:type="spellEnd"/>
-      <w:r>
-        <w:rPr>
-          <w:lang w:val="en-US"/>
-        </w:rPr>
-        <w:br/>
-        <w:t xml:space="preserve">cp -r </w:t>
-      </w:r>
-      <w:proofErr w:type="spellStart"/>
-      <w:r>
-        <w:rPr>
-          <w:lang w:val="en-US"/>
-        </w:rPr>
-        <w:t>claude_monet</w:t>
-      </w:r>
-      <w:proofErr w:type="spellEnd"/>
-      <w:r>
-        <w:rPr>
-          <w:lang w:val="en-US"/>
-        </w:rPr>
-        <w:t>/kitchen/</w:t>
-      </w:r>
-      <w:proofErr w:type="spellStart"/>
-      <w:r>
-        <w:rPr>
-          <w:lang w:val="en-US"/>
-        </w:rPr>
-        <w:t>morning_shift</w:t>
-      </w:r>
-      <w:proofErr w:type="spellEnd"/>
-      <w:r>
-        <w:rPr>
-          <w:lang w:val="en-US"/>
-        </w:rPr>
-        <w:t xml:space="preserve"> </w:t>
-      </w:r>
-      <w:proofErr w:type="spellStart"/>
-      <w:r>
-        <w:rPr>
-          <w:lang w:val="en-US"/>
-        </w:rPr>
-        <w:t>claude_monet</w:t>
-      </w:r>
-      <w:proofErr w:type="spellEnd"/>
-      <w:r>
-        <w:rPr>
-          <w:lang w:val="en-US"/>
-        </w:rPr>
-        <w:t>/kitchen/</w:t>
-      </w:r>
-      <w:proofErr w:type="spellStart"/>
-      <w:r>
-        <w:rPr>
-          <w:lang w:val="en-US"/>
-        </w:rPr>
-        <w:t>evening_shift</w:t>
-      </w:r>
-      <w:proofErr w:type="spellEnd"/>
-      <w:r>
-        <w:rPr>
-          <w:lang w:val="en-US"/>
-        </w:rPr>
-        <w:t>/</w:t>
-      </w:r>
-      <w:proofErr w:type="spellStart"/>
-      <w:r>
-        <w:rPr>
-          <w:lang w:val="en-US"/>
-        </w:rPr>
-        <w:t>morning_backup</w:t>
-      </w:r>
-      <w:proofErr w:type="spellEnd"/>
-      <w:r>
-        <w:rPr>
-          <w:lang w:val="en-US"/>
-        </w:rPr>
-        <w:br/>
-        <w:t>ln -s ../</w:t>
-      </w:r>
-      <w:proofErr w:type="spellStart"/>
-      <w:r>
-        <w:rPr>
-          <w:lang w:val="en-US"/>
-        </w:rPr>
-        <w:t>claude_monet</w:t>
-      </w:r>
-      <w:proofErr w:type="spellEnd"/>
-      <w:r>
-        <w:rPr>
-          <w:lang w:val="en-US"/>
-        </w:rPr>
-        <w:t>/kitchen/</w:t>
-      </w:r>
-      <w:proofErr w:type="spellStart"/>
-      <w:r>
-        <w:rPr>
-          <w:lang w:val="en-US"/>
-        </w:rPr>
-        <w:t>leva_order</w:t>
-      </w:r>
-      <w:proofErr w:type="spellEnd"/>
-      <w:r>
-        <w:rPr>
-          <w:lang w:val="en-US"/>
-        </w:rPr>
-        <w:t xml:space="preserve"> </w:t>
-      </w:r>
-      <w:proofErr w:type="spellStart"/>
-      <w:r>
-        <w:rPr>
-          <w:lang w:val="en-US"/>
-        </w:rPr>
-        <w:t>staff_room</w:t>
-      </w:r>
-      <w:proofErr w:type="spellEnd"/>
-      <w:r>
-        <w:rPr>
-          <w:lang w:val="en-US"/>
-        </w:rPr>
-        <w:t>/</w:t>
-      </w:r>
-      <w:proofErr w:type="spellStart"/>
-      <w:r>
-        <w:rPr>
-          <w:lang w:val="en-US"/>
-        </w:rPr>
-        <w:t>current_order</w:t>
-      </w:r>
-      <w:proofErr w:type="spellEnd"/>
-      <w:r>
-        <w:rPr>
-          <w:lang w:val="en-US"/>
-        </w:rPr>
-        <w:br/>
-        <w:t xml:space="preserve">ln -s </w:t>
-      </w:r>
-      <w:proofErr w:type="spellStart"/>
-      <w:r>
-        <w:rPr>
-          <w:lang w:val="en-US"/>
-        </w:rPr>
-        <w:t>claude_monet</w:t>
-      </w:r>
-      <w:proofErr w:type="spellEnd"/>
-      <w:r>
-        <w:rPr>
-          <w:lang w:val="en-US"/>
-        </w:rPr>
-        <w:t xml:space="preserve">/kitchen </w:t>
-      </w:r>
-      <w:proofErr w:type="spellStart"/>
-      <w:r>
-        <w:rPr>
-          <w:lang w:val="en-US"/>
-        </w:rPr>
-        <w:t>shift_kitchen</w:t>
-      </w:r>
-      <w:proofErr w:type="spellEnd"/>
-      <w:r>
-        <w:rPr>
-          <w:lang w:val="en-US"/>
-        </w:rPr>
-        <w:br/>
-        <w:t xml:space="preserve">ln </w:t>
-      </w:r>
-      <w:proofErr w:type="spellStart"/>
-      <w:r>
-        <w:rPr>
-          <w:lang w:val="en-US"/>
-        </w:rPr>
-        <w:t>shift_message</w:t>
-      </w:r>
-      <w:proofErr w:type="spellEnd"/>
-      <w:r>
-        <w:rPr>
-          <w:lang w:val="en-US"/>
-        </w:rPr>
-        <w:t xml:space="preserve"> </w:t>
-      </w:r>
-      <w:proofErr w:type="spellStart"/>
-      <w:r>
-        <w:rPr>
-          <w:lang w:val="en-US"/>
-        </w:rPr>
-        <w:t>claude_monet</w:t>
-      </w:r>
-      <w:proofErr w:type="spellEnd"/>
-      <w:r>
-        <w:rPr>
-          <w:lang w:val="en-US"/>
-        </w:rPr>
-        <w:t>/kitchen/</w:t>
-      </w:r>
-      <w:proofErr w:type="spellStart"/>
-      <w:r>
-        <w:rPr>
-          <w:lang w:val="en-US"/>
-        </w:rPr>
-        <w:t>common_message</w:t>
-      </w:r>
-      <w:proofErr w:type="spellEnd"/>
-      <w:r>
-        <w:rPr>
-          <w:lang w:val="en-US"/>
-        </w:rPr>
-        <w:br/>
-        <w:t xml:space="preserve">cat </w:t>
-      </w:r>
-      <w:proofErr w:type="spellStart"/>
-      <w:r>
-        <w:rPr>
-          <w:lang w:val="en-US"/>
-        </w:rPr>
-        <w:t>claude_monet</w:t>
-      </w:r>
-      <w:proofErr w:type="spellEnd"/>
-      <w:r>
-        <w:rPr>
-          <w:lang w:val="en-US"/>
-        </w:rPr>
-        <w:t>/kitchen/</w:t>
-      </w:r>
-      <w:proofErr w:type="spellStart"/>
-      <w:r>
-        <w:rPr>
-          <w:lang w:val="en-US"/>
-        </w:rPr>
-        <w:t>morning_shift</w:t>
-      </w:r>
-      <w:proofErr w:type="spellEnd"/>
-      <w:r>
-        <w:rPr>
-          <w:lang w:val="en-US"/>
-        </w:rPr>
-        <w:t>/</w:t>
-      </w:r>
-      <w:proofErr w:type="spellStart"/>
-      <w:r>
-        <w:rPr>
-          <w:lang w:val="en-US"/>
-        </w:rPr>
-        <w:t>senya_tasks</w:t>
-      </w:r>
-      <w:proofErr w:type="spellEnd"/>
-      <w:r>
-        <w:rPr>
-          <w:lang w:val="en-US"/>
-        </w:rPr>
-        <w:t xml:space="preserve"> </w:t>
-      </w:r>
-      <w:proofErr w:type="spellStart"/>
-      <w:r>
-        <w:rPr>
-          <w:lang w:val="en-US"/>
-        </w:rPr>
-        <w:t>claude_monet</w:t>
-      </w:r>
-      <w:proofErr w:type="spellEnd"/>
-      <w:r>
-        <w:rPr>
-          <w:lang w:val="en-US"/>
-        </w:rPr>
-        <w:t>/kitchen/</w:t>
-      </w:r>
-      <w:proofErr w:type="spellStart"/>
-      <w:r>
-        <w:rPr>
-          <w:lang w:val="en-US"/>
-        </w:rPr>
-        <w:t>morning_shift</w:t>
-      </w:r>
-      <w:proofErr w:type="spellEnd"/>
-      <w:r>
-        <w:rPr>
-          <w:lang w:val="en-US"/>
-        </w:rPr>
-        <w:t>/</w:t>
-      </w:r>
-      <w:proofErr w:type="spellStart"/>
-      <w:r>
-        <w:rPr>
-          <w:lang w:val="en-US"/>
-        </w:rPr>
-        <w:t>fedya_tasks</w:t>
-      </w:r>
-      <w:proofErr w:type="spellEnd"/>
-      <w:r>
-        <w:rPr>
-          <w:lang w:val="en-US"/>
-        </w:rPr>
-        <w:t xml:space="preserve"> &gt; </w:t>
-      </w:r>
-      <w:proofErr w:type="spellStart"/>
+        <w:t>cp staff_room/late_report claude_monet/office/discipline_report</w:t>
+      </w:r>
+      <w:r>
+        <w:rPr>
+          <w:lang w:val="en-US"/>
+        </w:rPr>
+        <w:br/>
+        <w:t>cp -r claude_monet/kitchen/morning_shift claude_monet/kitchen/evening_shift/morning_backup</w:t>
+      </w:r>
+      <w:r>
+        <w:rPr>
+          <w:lang w:val="en-US"/>
+        </w:rPr>
+        <w:br/>
+        <w:t>ln -s ../claude_monet/kitchen/leva_order staff_room/current_order</w:t>
+      </w:r>
+      <w:r>
+        <w:rPr>
+          <w:lang w:val="en-US"/>
+        </w:rPr>
+        <w:br/>
+        <w:t>ln -s claude_monet/kitchen shift_kitchen</w:t>
+      </w:r>
+      <w:r>
+        <w:rPr>
+          <w:lang w:val="en-US"/>
+        </w:rPr>
+        <w:br/>
+        <w:t>ln shift_message claude_monet/kitchen/common_message</w:t>
+      </w:r>
+      <w:r>
+        <w:rPr>
+          <w:lang w:val="en-US"/>
+        </w:rPr>
+        <w:br/>
+        <w:t xml:space="preserve">cat claude_monet/kitchen/morning_shift/senya_tasks claude_monet/kitchen/morning_shift/fedya_tasks &gt; </w:t>
+      </w:r>
       <w:r>
         <w:rPr>
           <w:lang w:val="en-US"/>
         </w:rPr>
         <w:lastRenderedPageBreak/>
-        <w:t>claude_monet</w:t>
-      </w:r>
-      <w:proofErr w:type="spellEnd"/>
-      <w:r>
-        <w:rPr>
-          <w:lang w:val="en-US"/>
-        </w:rPr>
-        <w:t>/kitchen/</w:t>
-      </w:r>
-      <w:proofErr w:type="spellStart"/>
-      <w:r>
-        <w:rPr>
-          <w:lang w:val="en-US"/>
-        </w:rPr>
-        <w:t>morning_report</w:t>
-      </w:r>
-      <w:proofErr w:type="spellEnd"/>
-      <w:r>
-        <w:rPr>
-          <w:lang w:val="en-US"/>
-        </w:rPr>
-        <w:br/>
-        <w:t xml:space="preserve">cat </w:t>
-      </w:r>
-      <w:proofErr w:type="spellStart"/>
-      <w:r>
-        <w:rPr>
-          <w:lang w:val="en-US"/>
-        </w:rPr>
-        <w:t>claude_monet</w:t>
-      </w:r>
-      <w:proofErr w:type="spellEnd"/>
-      <w:r>
-        <w:rPr>
-          <w:lang w:val="en-US"/>
-        </w:rPr>
-        <w:t>/office/</w:t>
-      </w:r>
-      <w:proofErr w:type="spellStart"/>
-      <w:r>
-        <w:rPr>
-          <w:lang w:val="en-US"/>
-        </w:rPr>
-        <w:t>barinov_schedule</w:t>
-      </w:r>
-      <w:proofErr w:type="spellEnd"/>
-      <w:r>
-        <w:rPr>
-          <w:lang w:val="en-US"/>
-        </w:rPr>
-        <w:t xml:space="preserve"> &gt;&gt; </w:t>
-      </w:r>
-      <w:proofErr w:type="spellStart"/>
-      <w:r>
-        <w:rPr>
-          <w:lang w:val="en-US"/>
-        </w:rPr>
-        <w:t>claude_monet</w:t>
-      </w:r>
-      <w:proofErr w:type="spellEnd"/>
-      <w:r>
-        <w:rPr>
-          <w:lang w:val="en-US"/>
-        </w:rPr>
-        <w:t>/kitchen/</w:t>
-      </w:r>
-      <w:proofErr w:type="spellStart"/>
-      <w:r>
-        <w:rPr>
-          <w:lang w:val="en-US"/>
-        </w:rPr>
-        <w:t>leva_order</w:t>
-      </w:r>
-      <w:proofErr w:type="spellEnd"/>
-      <w:r>
-        <w:rPr>
-          <w:lang w:val="en-US"/>
-        </w:rPr>
-        <w:br/>
-        <w:t xml:space="preserve">mv </w:t>
-      </w:r>
-      <w:proofErr w:type="spellStart"/>
-      <w:r>
-        <w:rPr>
-          <w:lang w:val="en-US"/>
-        </w:rPr>
-        <w:t>claude_monet</w:t>
-      </w:r>
-      <w:proofErr w:type="spellEnd"/>
-      <w:r>
-        <w:rPr>
-          <w:lang w:val="en-US"/>
-        </w:rPr>
-        <w:t xml:space="preserve">/hall/complaints </w:t>
-      </w:r>
-      <w:proofErr w:type="spellStart"/>
-      <w:r>
-        <w:rPr>
-          <w:lang w:val="en-US"/>
-        </w:rPr>
-        <w:t>claude_monet</w:t>
-      </w:r>
-      <w:proofErr w:type="spellEnd"/>
-      <w:r>
-        <w:rPr>
-          <w:lang w:val="en-US"/>
-        </w:rPr>
-        <w:t>/office/</w:t>
-      </w:r>
-      <w:proofErr w:type="spellStart"/>
-      <w:r>
-        <w:rPr>
-          <w:lang w:val="en-US"/>
-        </w:rPr>
-        <w:t>guest_complaints</w:t>
-      </w:r>
-      <w:proofErr w:type="spellEnd"/>
+        <w:t>claude_monet/kitchen/morning_report</w:t>
+      </w:r>
+      <w:r>
+        <w:rPr>
+          <w:lang w:val="en-US"/>
+        </w:rPr>
+        <w:br/>
+        <w:t>cat claude_monet/office/barinov_schedule &gt;&gt; claude_monet/kitchen/leva_order</w:t>
+      </w:r>
+      <w:r>
+        <w:rPr>
+          <w:lang w:val="en-US"/>
+        </w:rPr>
+        <w:br/>
+        <w:t>mv claude_monet/hall/complaints claude_monet/office/guest_complaints</w:t>
+      </w:r>
     </w:p>
     <w:p>
       <w:pPr>
@@ -4554,16 +2540,8 @@
           <w:lang w:val="en-US"/>
         </w:rPr>
         <w:br/>
-        <w:t xml:space="preserve">git </w:t>
-      </w:r>
-      <w:proofErr w:type="gramStart"/>
-      <w:r>
-        <w:rPr>
-          <w:lang w:val="en-US"/>
-        </w:rPr>
-        <w:t>add .</w:t>
-      </w:r>
-      <w:proofErr w:type="gramEnd"/>
+        <w:t>git add .</w:t>
+      </w:r>
       <w:r>
         <w:rPr>
           <w:lang w:val="en-US"/>
@@ -4679,16 +2657,11 @@
         <w:rPr>
           <w:lang w:val="en-US"/>
         </w:rPr>
-        <w:t xml:space="preserve"> ls, grep, sort, head, tail, </w:t>
-      </w:r>
-      <w:proofErr w:type="spellStart"/>
-      <w:r>
-        <w:rPr>
-          <w:lang w:val="en-US"/>
-        </w:rPr>
-        <w:t>wc</w:t>
-      </w:r>
-      <w:proofErr w:type="spellEnd"/>
+        <w:t xml:space="preserve"> ls, grep, sort, head, tail, wc </w:t>
+      </w:r>
+      <w:r>
+        <w:t>выполняют</w:t>
+      </w:r>
       <w:r>
         <w:rPr>
           <w:lang w:val="en-US"/>
@@ -4696,7 +2669,16 @@
         <w:t xml:space="preserve"> </w:t>
       </w:r>
       <w:r>
-        <w:t>выполняют</w:t>
+        <w:t>поиск</w:t>
+      </w:r>
+      <w:r>
+        <w:rPr>
+          <w:lang w:val="en-US"/>
+        </w:rPr>
+        <w:t xml:space="preserve">: </w:t>
+      </w:r>
+      <w:r>
+        <w:t>пять</w:t>
       </w:r>
       <w:r>
         <w:rPr>
@@ -4705,16 +2687,7 @@
         <w:t xml:space="preserve"> </w:t>
       </w:r>
       <w:r>
-        <w:t>поиск</w:t>
-      </w:r>
-      <w:r>
-        <w:rPr>
-          <w:lang w:val="en-US"/>
-        </w:rPr>
-        <w:t xml:space="preserve">: </w:t>
-      </w:r>
-      <w:r>
-        <w:t>пять</w:t>
+        <w:t>крупнейших</w:t>
       </w:r>
       <w:r>
         <w:rPr>
@@ -4723,7 +2696,7 @@
         <w:t xml:space="preserve"> </w:t>
       </w:r>
       <w:r>
-        <w:t>крупнейших</w:t>
+        <w:t>обычных</w:t>
       </w:r>
       <w:r>
         <w:rPr>
@@ -4732,7 +2705,16 @@
         <w:t xml:space="preserve"> </w:t>
       </w:r>
       <w:r>
-        <w:t>обычных</w:t>
+        <w:t>файлов</w:t>
+      </w:r>
+      <w:r>
+        <w:rPr>
+          <w:lang w:val="en-US"/>
+        </w:rPr>
+        <w:t xml:space="preserve"> lab0; </w:t>
+      </w:r>
+      <w:r>
+        <w:t>строки</w:t>
       </w:r>
       <w:r>
         <w:rPr>
@@ -4741,13 +2723,112 @@
         <w:t xml:space="preserve"> </w:t>
       </w:r>
       <w:r>
+        <w:t>с</w:t>
+      </w:r>
+      <w:r>
+        <w:rPr>
+          <w:lang w:val="en-US"/>
+        </w:rPr>
+        <w:t xml:space="preserve"> «</w:t>
+      </w:r>
+      <w:r>
+        <w:t>смен</w:t>
+      </w:r>
+      <w:r>
+        <w:rPr>
+          <w:lang w:val="en-US"/>
+        </w:rPr>
+        <w:t>»/«</w:t>
+      </w:r>
+      <w:r>
+        <w:t>лёва</w:t>
+      </w:r>
+      <w:r>
+        <w:rPr>
+          <w:lang w:val="en-US"/>
+        </w:rPr>
+        <w:t xml:space="preserve">» </w:t>
+      </w:r>
+      <w:r>
+        <w:t>без</w:t>
+      </w:r>
+      <w:r>
+        <w:rPr>
+          <w:lang w:val="en-US"/>
+        </w:rPr>
+        <w:t xml:space="preserve"> «</w:t>
+      </w:r>
+      <w:r>
+        <w:t>отчёт</w:t>
+      </w:r>
+      <w:r>
+        <w:rPr>
+          <w:lang w:val="en-US"/>
+        </w:rPr>
+        <w:t xml:space="preserve">»; </w:t>
+      </w:r>
+      <w:r>
+        <w:t>число</w:t>
+      </w:r>
+      <w:r>
+        <w:rPr>
+          <w:lang w:val="en-US"/>
+        </w:rPr>
+        <w:t xml:space="preserve"> </w:t>
+      </w:r>
+      <w:r>
         <w:t>файлов</w:t>
       </w:r>
       <w:r>
         <w:rPr>
           <w:lang w:val="en-US"/>
         </w:rPr>
-        <w:t xml:space="preserve"> lab0; </w:t>
+        <w:t xml:space="preserve"> </w:t>
+      </w:r>
+      <w:r>
+        <w:t>с</w:t>
+      </w:r>
+      <w:r>
+        <w:rPr>
+          <w:lang w:val="en-US"/>
+        </w:rPr>
+        <w:t xml:space="preserve"> «</w:t>
+      </w:r>
+      <w:r>
+        <w:t>смен</w:t>
+      </w:r>
+      <w:r>
+        <w:rPr>
+          <w:lang w:val="en-US"/>
+        </w:rPr>
+        <w:t xml:space="preserve">» </w:t>
+      </w:r>
+      <w:r>
+        <w:t>в</w:t>
+      </w:r>
+      <w:r>
+        <w:rPr>
+          <w:lang w:val="en-US"/>
+        </w:rPr>
+        <w:t xml:space="preserve"> morning_shift </w:t>
+      </w:r>
+      <w:r>
+        <w:t>и</w:t>
+      </w:r>
+      <w:r>
+        <w:rPr>
+          <w:lang w:val="en-US"/>
+        </w:rPr>
+        <w:t xml:space="preserve"> morning_backup; </w:t>
+      </w:r>
+      <w:r>
+        <w:t>последние</w:t>
+      </w:r>
+      <w:r>
+        <w:rPr>
+          <w:lang w:val="en-US"/>
+        </w:rPr>
+        <w:t xml:space="preserve"> </w:t>
       </w:r>
       <w:r>
         <w:t>строки</w:t>
@@ -4759,59 +2840,40 @@
         <w:t xml:space="preserve"> </w:t>
       </w:r>
       <w:r>
+        <w:t>файлов</w:t>
+      </w:r>
+      <w:r>
+        <w:rPr>
+          <w:lang w:val="en-US"/>
+        </w:rPr>
+        <w:t xml:space="preserve"> *_tasks </w:t>
+      </w:r>
+      <w:r>
         <w:t>с</w:t>
       </w:r>
       <w:r>
         <w:rPr>
           <w:lang w:val="en-US"/>
         </w:rPr>
-        <w:t xml:space="preserve"> «</w:t>
-      </w:r>
-      <w:r>
-        <w:t>смен</w:t>
-      </w:r>
-      <w:r>
-        <w:rPr>
-          <w:lang w:val="en-US"/>
-        </w:rPr>
-        <w:t>»</w:t>
-      </w:r>
-      <w:proofErr w:type="gramStart"/>
-      <w:r>
-        <w:rPr>
-          <w:lang w:val="en-US"/>
-        </w:rPr>
-        <w:t>/«</w:t>
-      </w:r>
-      <w:proofErr w:type="spellStart"/>
-      <w:proofErr w:type="gramEnd"/>
-      <w:r>
-        <w:t>лёва</w:t>
-      </w:r>
-      <w:proofErr w:type="spellEnd"/>
-      <w:r>
-        <w:rPr>
-          <w:lang w:val="en-US"/>
-        </w:rPr>
-        <w:t xml:space="preserve">» </w:t>
-      </w:r>
-      <w:r>
-        <w:t>без</w:t>
-      </w:r>
-      <w:r>
-        <w:rPr>
-          <w:lang w:val="en-US"/>
-        </w:rPr>
-        <w:t xml:space="preserve"> «</w:t>
-      </w:r>
-      <w:r>
-        <w:t>отчёт</w:t>
-      </w:r>
-      <w:r>
-        <w:rPr>
-          <w:lang w:val="en-US"/>
-        </w:rPr>
-        <w:t xml:space="preserve">»; </w:t>
+        <w:t xml:space="preserve"> </w:t>
+      </w:r>
+      <w:r>
+        <w:t>обратной</w:t>
+      </w:r>
+      <w:r>
+        <w:rPr>
+          <w:lang w:val="en-US"/>
+        </w:rPr>
+        <w:t xml:space="preserve"> </w:t>
+      </w:r>
+      <w:r>
+        <w:t>сортировкой</w:t>
+      </w:r>
+      <w:r>
+        <w:rPr>
+          <w:lang w:val="en-US"/>
+        </w:rPr>
+        <w:t xml:space="preserve">; </w:t>
       </w:r>
       <w:r>
         <w:t>число</w:t>
@@ -4823,7 +2885,7 @@
         <w:t xml:space="preserve"> </w:t>
       </w:r>
       <w:r>
-        <w:t>файлов</w:t>
+        <w:t>слов</w:t>
       </w:r>
       <w:r>
         <w:rPr>
@@ -4832,163 +2894,13 @@
         <w:t xml:space="preserve"> </w:t>
       </w:r>
       <w:r>
-        <w:t>с</w:t>
-      </w:r>
-      <w:r>
-        <w:rPr>
-          <w:lang w:val="en-US"/>
-        </w:rPr>
-        <w:t xml:space="preserve"> «</w:t>
-      </w:r>
-      <w:r>
-        <w:t>смен</w:t>
-      </w:r>
-      <w:r>
-        <w:rPr>
-          <w:lang w:val="en-US"/>
-        </w:rPr>
-        <w:t xml:space="preserve">» </w:t>
-      </w:r>
-      <w:r>
         <w:t>в</w:t>
       </w:r>
       <w:r>
         <w:rPr>
           <w:lang w:val="en-US"/>
         </w:rPr>
-        <w:t xml:space="preserve"> </w:t>
-      </w:r>
-      <w:proofErr w:type="spellStart"/>
-      <w:r>
-        <w:rPr>
-          <w:lang w:val="en-US"/>
-        </w:rPr>
-        <w:t>morning_shift</w:t>
-      </w:r>
-      <w:proofErr w:type="spellEnd"/>
-      <w:r>
-        <w:rPr>
-          <w:lang w:val="en-US"/>
-        </w:rPr>
-        <w:t xml:space="preserve"> </w:t>
-      </w:r>
-      <w:r>
-        <w:t>и</w:t>
-      </w:r>
-      <w:r>
-        <w:rPr>
-          <w:lang w:val="en-US"/>
-        </w:rPr>
-        <w:t xml:space="preserve"> </w:t>
-      </w:r>
-      <w:proofErr w:type="spellStart"/>
-      <w:r>
-        <w:rPr>
-          <w:lang w:val="en-US"/>
-        </w:rPr>
-        <w:t>morning_backup</w:t>
-      </w:r>
-      <w:proofErr w:type="spellEnd"/>
-      <w:r>
-        <w:rPr>
-          <w:lang w:val="en-US"/>
-        </w:rPr>
-        <w:t xml:space="preserve">; </w:t>
-      </w:r>
-      <w:r>
-        <w:t>последние</w:t>
-      </w:r>
-      <w:r>
-        <w:rPr>
-          <w:lang w:val="en-US"/>
-        </w:rPr>
-        <w:t xml:space="preserve"> </w:t>
-      </w:r>
-      <w:r>
-        <w:t>строки</w:t>
-      </w:r>
-      <w:r>
-        <w:rPr>
-          <w:lang w:val="en-US"/>
-        </w:rPr>
-        <w:t xml:space="preserve"> </w:t>
-      </w:r>
-      <w:r>
-        <w:t>файлов</w:t>
-      </w:r>
-      <w:r>
-        <w:rPr>
-          <w:lang w:val="en-US"/>
-        </w:rPr>
-        <w:t xml:space="preserve"> *_tasks </w:t>
-      </w:r>
-      <w:r>
-        <w:t>с</w:t>
-      </w:r>
-      <w:r>
-        <w:rPr>
-          <w:lang w:val="en-US"/>
-        </w:rPr>
-        <w:t xml:space="preserve"> </w:t>
-      </w:r>
-      <w:r>
-        <w:t>обратной</w:t>
-      </w:r>
-      <w:r>
-        <w:rPr>
-          <w:lang w:val="en-US"/>
-        </w:rPr>
-        <w:t xml:space="preserve"> </w:t>
-      </w:r>
-      <w:r>
-        <w:t>сортировкой</w:t>
-      </w:r>
-      <w:r>
-        <w:rPr>
-          <w:lang w:val="en-US"/>
-        </w:rPr>
-        <w:t xml:space="preserve">; </w:t>
-      </w:r>
-      <w:r>
-        <w:t>число</w:t>
-      </w:r>
-      <w:r>
-        <w:rPr>
-          <w:lang w:val="en-US"/>
-        </w:rPr>
-        <w:t xml:space="preserve"> </w:t>
-      </w:r>
-      <w:r>
-        <w:t>слов</w:t>
-      </w:r>
-      <w:r>
-        <w:rPr>
-          <w:lang w:val="en-US"/>
-        </w:rPr>
-        <w:t xml:space="preserve"> </w:t>
-      </w:r>
-      <w:r>
-        <w:t>в</w:t>
-      </w:r>
-      <w:r>
-        <w:rPr>
-          <w:lang w:val="en-US"/>
-        </w:rPr>
-        <w:t xml:space="preserve"> </w:t>
-      </w:r>
-      <w:proofErr w:type="spellStart"/>
-      <w:r>
-        <w:rPr>
-          <w:lang w:val="en-US"/>
-        </w:rPr>
-        <w:t>morning_report</w:t>
-      </w:r>
-      <w:proofErr w:type="spellEnd"/>
-      <w:r>
-        <w:rPr>
-          <w:lang w:val="en-US"/>
-        </w:rPr>
-        <w:t xml:space="preserve">; </w:t>
+        <w:t xml:space="preserve"> morning_report; </w:t>
       </w:r>
       <w:r>
         <w:t>файлы</w:t>
@@ -5097,49 +3009,7 @@
         <w:rPr>
           <w:b/>
         </w:rPr>
-        <w:t xml:space="preserve"> </w:t>
-      </w:r>
-      <w:proofErr w:type="spellStart"/>
-      <w:r>
-        <w:rPr>
-          <w:b/>
-        </w:rPr>
-        <w:t>ls</w:t>
-      </w:r>
-      <w:proofErr w:type="spellEnd"/>
-      <w:r>
-        <w:rPr>
-          <w:b/>
-        </w:rPr>
-        <w:t xml:space="preserve">, </w:t>
-      </w:r>
-      <w:proofErr w:type="spellStart"/>
-      <w:r>
-        <w:rPr>
-          <w:b/>
-        </w:rPr>
-        <w:t>cat</w:t>
-      </w:r>
-      <w:proofErr w:type="spellEnd"/>
-      <w:r>
-        <w:rPr>
-          <w:b/>
-        </w:rPr>
-        <w:t xml:space="preserve">, </w:t>
-      </w:r>
-      <w:proofErr w:type="spellStart"/>
-      <w:r>
-        <w:rPr>
-          <w:b/>
-        </w:rPr>
-        <w:t>grep</w:t>
-      </w:r>
-      <w:proofErr w:type="spellEnd"/>
-      <w:r>
-        <w:rPr>
-          <w:b/>
-        </w:rPr>
-        <w:t>, sort, head, tail, wc)</w:t>
+        <w:t xml:space="preserve"> ls, cat, grep, sort, head, tail, wc)</w:t>
       </w:r>
     </w:p>
     <w:p>
@@ -5255,16 +3125,8 @@
           <w:lang w:val="en-US"/>
         </w:rPr>
         <w:br/>
-        <w:t xml:space="preserve">git </w:t>
-      </w:r>
-      <w:proofErr w:type="gramStart"/>
-      <w:r>
-        <w:rPr>
-          <w:lang w:val="en-US"/>
-        </w:rPr>
-        <w:t>add .</w:t>
-      </w:r>
-      <w:proofErr w:type="gramEnd"/>
+        <w:t>git add .</w:t>
+      </w:r>
       <w:r>
         <w:rPr>
           <w:lang w:val="en-US"/>
@@ -5345,59 +3207,19 @@
         <w:t>– н</w:t>
       </w:r>
       <w:r>
-        <w:t xml:space="preserve">езависимо от файла), </w:t>
-      </w:r>
-      <w:proofErr w:type="spellStart"/>
-      <w:r>
-        <w:t>rmdir</w:t>
-      </w:r>
-      <w:proofErr w:type="spellEnd"/>
-      <w:r>
-        <w:t xml:space="preserve"> </w:t>
+        <w:t xml:space="preserve">езависимо от файла), rmdir </w:t>
       </w:r>
       <w:r>
         <w:t>– п</w:t>
       </w:r>
       <w:r>
-        <w:t xml:space="preserve">устой </w:t>
-      </w:r>
-      <w:proofErr w:type="spellStart"/>
-      <w:r>
-        <w:t>reserve_empty</w:t>
-      </w:r>
-      <w:proofErr w:type="spellEnd"/>
-      <w:r>
-        <w:t xml:space="preserve">, </w:t>
-      </w:r>
-      <w:proofErr w:type="spellStart"/>
-      <w:r>
-        <w:t>rm</w:t>
-      </w:r>
-      <w:proofErr w:type="spellEnd"/>
-      <w:r>
-        <w:t xml:space="preserve"> -</w:t>
-      </w:r>
-      <w:proofErr w:type="spellStart"/>
-      <w:r>
-        <w:t>rf</w:t>
-      </w:r>
-      <w:proofErr w:type="spellEnd"/>
-      <w:r>
-        <w:t xml:space="preserve"> </w:t>
+        <w:t xml:space="preserve">устой reserve_empty, rm -rf </w:t>
       </w:r>
       <w:r>
         <w:t>– н</w:t>
       </w:r>
       <w:r>
-        <w:t xml:space="preserve">епустой </w:t>
-      </w:r>
-      <w:proofErr w:type="spellStart"/>
-      <w:r>
-        <w:t>morning_backup</w:t>
-      </w:r>
-      <w:proofErr w:type="spellEnd"/>
-      <w:r>
-        <w:t>. Коммит «Fifth subtask» фиксирует удаления.</w:t>
+        <w:t>епустой morning_backup. Коммит «Fifth subtask» фиксирует удаления.</w:t>
       </w:r>
     </w:p>
     <w:p>
@@ -5424,232 +3246,57 @@
         <w:rPr>
           <w:lang w:val="en-US"/>
         </w:rPr>
-        <w:t xml:space="preserve">rm </w:t>
-      </w:r>
-      <w:proofErr w:type="spellStart"/>
-      <w:r>
-        <w:rPr>
-          <w:lang w:val="en-US"/>
-        </w:rPr>
-        <w:t>staff_room</w:t>
-      </w:r>
-      <w:proofErr w:type="spellEnd"/>
-      <w:r>
-        <w:rPr>
-          <w:lang w:val="en-US"/>
-        </w:rPr>
-        <w:t>/</w:t>
-      </w:r>
-      <w:proofErr w:type="spellStart"/>
-      <w:r>
-        <w:rPr>
-          <w:lang w:val="en-US"/>
-        </w:rPr>
-        <w:t>late_report</w:t>
-      </w:r>
-      <w:proofErr w:type="spellEnd"/>
-      <w:r>
-        <w:rPr>
-          <w:lang w:val="en-US"/>
-        </w:rPr>
-        <w:br/>
-        <w:t xml:space="preserve">rm </w:t>
-      </w:r>
-      <w:proofErr w:type="spellStart"/>
-      <w:r>
-        <w:rPr>
-          <w:lang w:val="en-US"/>
-        </w:rPr>
-        <w:t>staff_room</w:t>
-      </w:r>
-      <w:proofErr w:type="spellEnd"/>
-      <w:r>
-        <w:rPr>
-          <w:lang w:val="en-US"/>
-        </w:rPr>
-        <w:t>/</w:t>
-      </w:r>
-      <w:proofErr w:type="spellStart"/>
-      <w:r>
-        <w:rPr>
-          <w:lang w:val="en-US"/>
-        </w:rPr>
-        <w:t>current_order</w:t>
-      </w:r>
-      <w:proofErr w:type="spellEnd"/>
-      <w:r>
-        <w:rPr>
-          <w:lang w:val="en-US"/>
-        </w:rPr>
-        <w:br/>
-        <w:t xml:space="preserve">rm </w:t>
-      </w:r>
-      <w:proofErr w:type="spellStart"/>
-      <w:r>
-        <w:rPr>
-          <w:lang w:val="en-US"/>
-        </w:rPr>
-        <w:t>shift_kitchen</w:t>
-      </w:r>
-      <w:proofErr w:type="spellEnd"/>
-      <w:r>
-        <w:rPr>
-          <w:lang w:val="en-US"/>
-        </w:rPr>
-        <w:br/>
-        <w:t xml:space="preserve">rm </w:t>
-      </w:r>
-      <w:proofErr w:type="spellStart"/>
-      <w:r>
-        <w:rPr>
-          <w:lang w:val="en-US"/>
-        </w:rPr>
-        <w:t>shift_message</w:t>
-      </w:r>
-      <w:proofErr w:type="spellEnd"/>
-      <w:r>
-        <w:rPr>
-          <w:lang w:val="en-US"/>
-        </w:rPr>
-        <w:br/>
-        <w:t xml:space="preserve">rm </w:t>
-      </w:r>
-      <w:proofErr w:type="spellStart"/>
-      <w:r>
-        <w:rPr>
-          <w:lang w:val="en-US"/>
-        </w:rPr>
-        <w:t>claude_monet</w:t>
-      </w:r>
-      <w:proofErr w:type="spellEnd"/>
-      <w:r>
-        <w:rPr>
-          <w:lang w:val="en-US"/>
-        </w:rPr>
-        <w:t>/kitchen/</w:t>
-      </w:r>
-      <w:proofErr w:type="spellStart"/>
-      <w:r>
-        <w:rPr>
-          <w:lang w:val="en-US"/>
-        </w:rPr>
-        <w:t>common_message</w:t>
-      </w:r>
-      <w:proofErr w:type="spellEnd"/>
-      <w:r>
-        <w:rPr>
-          <w:lang w:val="en-US"/>
-        </w:rPr>
-        <w:br/>
-        <w:t xml:space="preserve">rm </w:t>
-      </w:r>
-      <w:proofErr w:type="spellStart"/>
-      <w:r>
-        <w:rPr>
-          <w:lang w:val="en-US"/>
-        </w:rPr>
-        <w:t>claude_monet</w:t>
-      </w:r>
-      <w:proofErr w:type="spellEnd"/>
-      <w:r>
-        <w:rPr>
-          <w:lang w:val="en-US"/>
-        </w:rPr>
-        <w:t>/kitchen/</w:t>
-      </w:r>
-      <w:proofErr w:type="spellStart"/>
-      <w:r>
-        <w:rPr>
-          <w:lang w:val="en-US"/>
-        </w:rPr>
-        <w:t>evening_shift</w:t>
-      </w:r>
-      <w:proofErr w:type="spellEnd"/>
-      <w:r>
-        <w:rPr>
-          <w:lang w:val="en-US"/>
-        </w:rPr>
-        <w:t>/</w:t>
-      </w:r>
-      <w:proofErr w:type="spellStart"/>
-      <w:r>
-        <w:rPr>
-          <w:lang w:val="en-US"/>
-        </w:rPr>
-        <w:t>denis_tasks</w:t>
-      </w:r>
-      <w:proofErr w:type="spellEnd"/>
-      <w:r>
-        <w:rPr>
-          <w:lang w:val="en-US"/>
-        </w:rPr>
-        <w:br/>
-      </w:r>
-      <w:proofErr w:type="spellStart"/>
-      <w:r>
-        <w:rPr>
-          <w:lang w:val="en-US"/>
-        </w:rPr>
-        <w:t>rmdir</w:t>
-      </w:r>
-      <w:proofErr w:type="spellEnd"/>
-      <w:r>
-        <w:rPr>
-          <w:lang w:val="en-US"/>
-        </w:rPr>
-        <w:t xml:space="preserve"> </w:t>
-      </w:r>
-      <w:proofErr w:type="spellStart"/>
-      <w:r>
-        <w:rPr>
-          <w:lang w:val="en-US"/>
-        </w:rPr>
-        <w:t>reserve_empty</w:t>
-      </w:r>
-      <w:proofErr w:type="spellEnd"/>
-      <w:r>
-        <w:rPr>
-          <w:lang w:val="en-US"/>
-        </w:rPr>
-        <w:br/>
-        <w:t xml:space="preserve">rm -rf </w:t>
-      </w:r>
-      <w:proofErr w:type="spellStart"/>
-      <w:r>
-        <w:rPr>
-          <w:lang w:val="en-US"/>
-        </w:rPr>
-        <w:t>claude_monet</w:t>
-      </w:r>
-      <w:proofErr w:type="spellEnd"/>
-      <w:r>
-        <w:rPr>
-          <w:lang w:val="en-US"/>
-        </w:rPr>
-        <w:t>/kitchen/</w:t>
-      </w:r>
-      <w:proofErr w:type="spellStart"/>
-      <w:r>
-        <w:rPr>
-          <w:lang w:val="en-US"/>
-        </w:rPr>
-        <w:t>evening_shift</w:t>
-      </w:r>
-      <w:proofErr w:type="spellEnd"/>
-      <w:r>
-        <w:rPr>
-          <w:lang w:val="en-US"/>
-        </w:rPr>
-        <w:t>/</w:t>
-      </w:r>
-      <w:proofErr w:type="spellStart"/>
-      <w:r>
-        <w:rPr>
-          <w:lang w:val="en-US"/>
-        </w:rPr>
-        <w:t>morning_backup</w:t>
-      </w:r>
-      <w:proofErr w:type="spellEnd"/>
+        <w:t>rm staff_room/late_report</w:t>
+      </w:r>
+      <w:r>
+        <w:rPr>
+          <w:lang w:val="en-US"/>
+        </w:rPr>
+        <w:br/>
+        <w:t>rm staff_room/current_order</w:t>
+      </w:r>
+      <w:r>
+        <w:rPr>
+          <w:lang w:val="en-US"/>
+        </w:rPr>
+        <w:br/>
+        <w:t>rm shift_kitchen</w:t>
+      </w:r>
+      <w:r>
+        <w:rPr>
+          <w:lang w:val="en-US"/>
+        </w:rPr>
+        <w:br/>
+        <w:t>rm shift_message</w:t>
+      </w:r>
+      <w:r>
+        <w:rPr>
+          <w:lang w:val="en-US"/>
+        </w:rPr>
+        <w:br/>
+        <w:t>rm claude_monet/kitchen/common_message</w:t>
+      </w:r>
+      <w:r>
+        <w:rPr>
+          <w:lang w:val="en-US"/>
+        </w:rPr>
+        <w:br/>
+        <w:t>rm claude_monet/kitchen/evening_shift/denis_tasks</w:t>
+      </w:r>
+      <w:r>
+        <w:rPr>
+          <w:lang w:val="en-US"/>
+        </w:rPr>
+        <w:br/>
+        <w:t>rmdir reserve_empty</w:t>
+      </w:r>
+      <w:r>
+        <w:rPr>
+          <w:lang w:val="en-US"/>
+        </w:rPr>
+        <w:br/>
+        <w:t>rm -rf claude_monet/kitchen/evening_shift/morning_backup</w:t>
+      </w:r>
     </w:p>
     <w:p>
       <w:pPr>
@@ -5744,16 +3391,8 @@
           <w:lang w:val="en-US"/>
         </w:rPr>
         <w:br/>
-        <w:t xml:space="preserve">git </w:t>
-      </w:r>
-      <w:proofErr w:type="gramStart"/>
-      <w:r>
-        <w:rPr>
-          <w:lang w:val="en-US"/>
-        </w:rPr>
-        <w:t>add .</w:t>
-      </w:r>
-      <w:proofErr w:type="gramEnd"/>
+        <w:t>git add .</w:t>
+      </w:r>
       <w:r>
         <w:rPr>
           <w:lang w:val="en-US"/>
@@ -5841,7 +3480,6 @@
         </w:rPr>
         <w:t xml:space="preserve">В ходе работы научился создавать директории с помощью команды </w:t>
       </w:r>
-      <w:proofErr w:type="spellStart"/>
       <w:r>
         <w:rPr>
           <w:rFonts w:ascii="Courier New" w:hAnsi="Courier New"/>
@@ -5852,7 +3490,6 @@
         </w:rPr>
         <w:t>mkdir</w:t>
       </w:r>
-      <w:proofErr w:type="spellEnd"/>
       <w:r>
         <w:rPr>
           <w:rFonts w:ascii="Courier New" w:hAnsi="Courier New"/>
@@ -5979,7 +3616,6 @@
         </w:rPr>
         <w:t xml:space="preserve">и </w:t>
       </w:r>
-      <w:proofErr w:type="spellStart"/>
       <w:r>
         <w:rPr>
           <w:rFonts w:ascii="Courier New" w:hAnsi="Courier New"/>
@@ -5990,7 +3626,6 @@
         </w:rPr>
         <w:t>rmdir</w:t>
       </w:r>
-      <w:proofErr w:type="spellEnd"/>
       <w:r>
         <w:rPr>
           <w:b w:val="0"/>
@@ -6106,7 +3741,6 @@
           </w:rPr>
           <w:t>://</w:t>
         </w:r>
-        <w:proofErr w:type="spellStart"/>
         <w:r>
           <w:rPr>
             <w:rStyle w:val="Hyperlink"/>
@@ -6114,7 +3748,6 @@
           </w:rPr>
           <w:t>opncd</w:t>
         </w:r>
-        <w:proofErr w:type="spellEnd"/>
         <w:r>
           <w:rPr>
             <w:rStyle w:val="Hyperlink"/>
@@ -6126,14 +3759,20 @@
             <w:rStyle w:val="Hyperlink"/>
             <w:lang w:val="en-US"/>
           </w:rPr>
-          <w:t>a</w:t>
+          <w:t>ai</w:t>
+        </w:r>
+        <w:r>
+          <w:rPr>
+            <w:rStyle w:val="Hyperlink"/>
+          </w:rPr>
+          <w:t>/</w:t>
         </w:r>
         <w:r>
           <w:rPr>
             <w:rStyle w:val="Hyperlink"/>
             <w:lang w:val="en-US"/>
           </w:rPr>
-          <w:t>i</w:t>
+          <w:t>share</w:t>
         </w:r>
         <w:r>
           <w:rPr>
@@ -6146,131 +3785,100 @@
             <w:rStyle w:val="Hyperlink"/>
             <w:lang w:val="en-US"/>
           </w:rPr>
-          <w:t>share</w:t>
+          <w:t>Kdq</w:t>
         </w:r>
         <w:r>
           <w:rPr>
             <w:rStyle w:val="Hyperlink"/>
           </w:rPr>
-          <w:t>/</w:t>
-        </w:r>
-        <w:proofErr w:type="spellStart"/>
+          <w:t>3</w:t>
+        </w:r>
         <w:r>
           <w:rPr>
             <w:rStyle w:val="Hyperlink"/>
             <w:lang w:val="en-US"/>
           </w:rPr>
-          <w:t>Kdq</w:t>
-        </w:r>
-        <w:proofErr w:type="spellEnd"/>
-        <w:r>
-          <w:rPr>
-            <w:rStyle w:val="Hyperlink"/>
-          </w:rPr>
-          <w:t>3</w:t>
-        </w:r>
-        <w:proofErr w:type="spellStart"/>
+          <w:t>SGBh</w:t>
+        </w:r>
+      </w:hyperlink>
+    </w:p>
+    <w:p>
+      <w:pPr>
+        <w:rPr>
+          <w:lang w:val="en-US"/>
+        </w:rPr>
+      </w:pPr>
+      <w:hyperlink r:id="rId19" w:history="1">
         <w:r>
           <w:rPr>
             <w:rStyle w:val="Hyperlink"/>
             <w:lang w:val="en-US"/>
           </w:rPr>
-          <w:t>SGBh</w:t>
-        </w:r>
-        <w:proofErr w:type="spellEnd"/>
-      </w:hyperlink>
-    </w:p>
-    <w:p>
-      <w:pPr>
-        <w:rPr>
-          <w:lang w:val="en-US"/>
-        </w:rPr>
-      </w:pPr>
-      <w:hyperlink r:id="rId19" w:history="1">
+          <w:t>https</w:t>
+        </w:r>
+        <w:r>
+          <w:rPr>
+            <w:rStyle w:val="Hyperlink"/>
+          </w:rPr>
+          <w:t>://</w:t>
+        </w:r>
         <w:r>
           <w:rPr>
             <w:rStyle w:val="Hyperlink"/>
             <w:lang w:val="en-US"/>
           </w:rPr>
-          <w:t>https</w:t>
+          <w:t>opncd</w:t>
         </w:r>
         <w:r>
           <w:rPr>
             <w:rStyle w:val="Hyperlink"/>
           </w:rPr>
-          <w:t>://</w:t>
+          <w:t>.</w:t>
         </w:r>
         <w:r>
           <w:rPr>
             <w:rStyle w:val="Hyperlink"/>
             <w:lang w:val="en-US"/>
           </w:rPr>
-          <w:t>opn</w:t>
+          <w:t>ai</w:t>
+        </w:r>
+        <w:r>
+          <w:rPr>
+            <w:rStyle w:val="Hyperlink"/>
+          </w:rPr>
+          <w:t>/</w:t>
         </w:r>
         <w:r>
           <w:rPr>
             <w:rStyle w:val="Hyperlink"/>
             <w:lang w:val="en-US"/>
           </w:rPr>
-          <w:t>c</w:t>
+          <w:t>share</w:t>
+        </w:r>
+        <w:r>
+          <w:rPr>
+            <w:rStyle w:val="Hyperlink"/>
+          </w:rPr>
+          <w:t>/</w:t>
         </w:r>
         <w:r>
           <w:rPr>
             <w:rStyle w:val="Hyperlink"/>
             <w:lang w:val="en-US"/>
           </w:rPr>
-          <w:t>d</w:t>
+          <w:t>CBqVbm</w:t>
         </w:r>
         <w:r>
           <w:rPr>
             <w:rStyle w:val="Hyperlink"/>
           </w:rPr>
-          <w:t>.</w:t>
+          <w:t>6</w:t>
         </w:r>
         <w:r>
           <w:rPr>
             <w:rStyle w:val="Hyperlink"/>
             <w:lang w:val="en-US"/>
           </w:rPr>
-          <w:t>ai</w:t>
-        </w:r>
-        <w:r>
-          <w:rPr>
-            <w:rStyle w:val="Hyperlink"/>
-          </w:rPr>
-          <w:t>/</w:t>
-        </w:r>
-        <w:r>
-          <w:rPr>
-            <w:rStyle w:val="Hyperlink"/>
-            <w:lang w:val="en-US"/>
-          </w:rPr>
-          <w:t>share</w:t>
-        </w:r>
-        <w:r>
-          <w:rPr>
-            <w:rStyle w:val="Hyperlink"/>
-          </w:rPr>
-          <w:t>/</w:t>
-        </w:r>
-        <w:r>
-          <w:rPr>
-            <w:rStyle w:val="Hyperlink"/>
-            <w:lang w:val="en-US"/>
-          </w:rPr>
-          <w:t>CBqVbm</w:t>
-        </w:r>
-        <w:r>
-          <w:rPr>
-            <w:rStyle w:val="Hyperlink"/>
-          </w:rPr>
-          <w:t>6</w:t>
-        </w:r>
-        <w:r>
-          <w:rPr>
-            <w:rStyle w:val="Hyperlink"/>
-            <w:lang w:val="en-US"/>
-          </w:rPr>
           <w:t>f</w:t>
         </w:r>
       </w:hyperlink>
@@ -6298,6 +3906,7 @@
       <w:pPr>
         <w:rPr>
           <w:rStyle w:val="Hyperlink"/>
+          <w:lang w:val="en-US"/>
         </w:rPr>
       </w:pPr>
       <w:r>
@@ -6407,6 +4016,11 @@
         <w:rPr>
           <w:rStyle w:val="Hyperlink"/>
         </w:rPr>
+      </w:r>
+      <w:r>
+        <w:rPr>
+          <w:rStyle w:val="Hyperlink"/>
+        </w:rPr>
         <w:fldChar w:fldCharType="separate"/>
       </w:r>
       <w:r>
@@ -6422,41 +4036,38 @@
         </w:rPr>
         <w:t>://</w:t>
       </w:r>
-      <w:proofErr w:type="spellStart"/>
       <w:r>
         <w:rPr>
           <w:rStyle w:val="Hyperlink"/>
           <w:lang w:val="en-US"/>
         </w:rPr>
-        <w:t>gith</w:t>
+        <w:t>github</w:t>
       </w:r>
       <w:r>
         <w:rPr>
           <w:rStyle w:val="Hyperlink"/>
-          <w:lang w:val="en-US"/>
-        </w:rPr>
-        <w:t>u</w:t>
+        </w:rPr>
+        <w:t>.</w:t>
       </w:r>
       <w:r>
         <w:rPr>
           <w:rStyle w:val="Hyperlink"/>
           <w:lang w:val="en-US"/>
         </w:rPr>
-        <w:t>b</w:t>
-      </w:r>
-      <w:proofErr w:type="spellEnd"/>
+        <w:t>com</w:t>
+      </w:r>
       <w:r>
         <w:rPr>
           <w:rStyle w:val="Hyperlink"/>
         </w:rPr>
-        <w:t>.</w:t>
+        <w:t>/</w:t>
       </w:r>
       <w:r>
         <w:rPr>
           <w:rStyle w:val="Hyperlink"/>
           <w:lang w:val="en-US"/>
         </w:rPr>
-        <w:t>com</w:t>
+        <w:t>dylorone</w:t>
       </w:r>
       <w:r>
         <w:rPr>
@@ -6464,71 +4075,158 @@
         </w:rPr>
         <w:t>/</w:t>
       </w:r>
-      <w:proofErr w:type="spellStart"/>
       <w:r>
         <w:rPr>
           <w:rStyle w:val="Hyperlink"/>
           <w:lang w:val="en-US"/>
         </w:rPr>
-        <w:t>dylorone</w:t>
-      </w:r>
-      <w:proofErr w:type="spellEnd"/>
+        <w:t>avs</w:t>
+      </w:r>
       <w:r>
         <w:rPr>
           <w:rStyle w:val="Hyperlink"/>
         </w:rPr>
-        <w:t>/</w:t>
-      </w:r>
-      <w:proofErr w:type="spellStart"/>
+        <w:t>_</w:t>
+      </w:r>
       <w:r>
         <w:rPr>
           <w:rStyle w:val="Hyperlink"/>
           <w:lang w:val="en-US"/>
         </w:rPr>
-        <w:t>avs</w:t>
-      </w:r>
-      <w:proofErr w:type="spellEnd"/>
+        <w:t>lab</w:t>
+      </w:r>
       <w:r>
         <w:rPr>
           <w:rStyle w:val="Hyperlink"/>
         </w:rPr>
-        <w:t>_</w:t>
+        <w:t>1_</w:t>
       </w:r>
       <w:r>
         <w:rPr>
           <w:rStyle w:val="Hyperlink"/>
           <w:lang w:val="en-US"/>
         </w:rPr>
-        <w:t>lab</w:t>
+        <w:t>source</w:t>
       </w:r>
       <w:r>
         <w:rPr>
           <w:rStyle w:val="Hyperlink"/>
         </w:rPr>
-        <w:t>1_</w:t>
-      </w:r>
-      <w:r>
-        <w:rPr>
-          <w:rStyle w:val="Hyperlink"/>
-          <w:lang w:val="en-US"/>
-        </w:rPr>
-        <w:t>source</w:t>
-      </w:r>
-      <w:r>
-        <w:rPr>
-          <w:rStyle w:val="Hyperlink"/>
-        </w:rPr>
         <w:fldChar w:fldCharType="end"/>
       </w:r>
     </w:p>
-    <w:p/>
     <w:p>
       <w:pPr>
         <w:pStyle w:val="Heading2"/>
         <w:ind w:firstLine="567"/>
-      </w:pPr>
-      <w:r>
-        <w:lastRenderedPageBreak/>
+        <w:rPr>
+          <w:rStyle w:val="Hyperlink"/>
+          <w:u w:val="none"/>
+        </w:rPr>
+      </w:pPr>
+      <w:r>
+        <w:t>Репозиторий, созданный в рамках лабы</w:t>
+      </w:r>
+    </w:p>
+    <w:p>
+      <w:pPr>
+        <w:rPr>
+          <w:rStyle w:val="Hyperlink"/>
+        </w:rPr>
+      </w:pPr>
+      <w:r>
+        <w:rPr>
+          <w:rStyle w:val="Hyperlink"/>
+          <w:lang w:val="en-US"/>
+        </w:rPr>
+        <w:t>https</w:t>
+      </w:r>
+      <w:r>
+        <w:rPr>
+          <w:rStyle w:val="Hyperlink"/>
+        </w:rPr>
+        <w:t>://</w:t>
+      </w:r>
+      <w:r>
+        <w:rPr>
+          <w:rStyle w:val="Hyperlink"/>
+          <w:lang w:val="en-US"/>
+        </w:rPr>
+        <w:t>github</w:t>
+      </w:r>
+      <w:r>
+        <w:rPr>
+          <w:rStyle w:val="Hyperlink"/>
+        </w:rPr>
+        <w:t>.</w:t>
+      </w:r>
+      <w:r>
+        <w:rPr>
+          <w:rStyle w:val="Hyperlink"/>
+          <w:lang w:val="en-US"/>
+        </w:rPr>
+        <w:t>com</w:t>
+      </w:r>
+      <w:r>
+        <w:rPr>
+          <w:rStyle w:val="Hyperlink"/>
+        </w:rPr>
+        <w:t>/</w:t>
+      </w:r>
+      <w:r>
+        <w:rPr>
+          <w:rStyle w:val="Hyperlink"/>
+          <w:lang w:val="en-US"/>
+        </w:rPr>
+        <w:t>dylorone</w:t>
+      </w:r>
+      <w:r>
+        <w:rPr>
+          <w:rStyle w:val="Hyperlink"/>
+        </w:rPr>
+        <w:t>/</w:t>
+      </w:r>
+      <w:r>
+        <w:rPr>
+          <w:rStyle w:val="Hyperlink"/>
+          <w:lang w:val="en-US"/>
+        </w:rPr>
+        <w:t>avs</w:t>
+      </w:r>
+      <w:r>
+        <w:rPr>
+          <w:rStyle w:val="Hyperlink"/>
+        </w:rPr>
+        <w:t>_</w:t>
+      </w:r>
+      <w:r>
+        <w:rPr>
+          <w:rStyle w:val="Hyperlink"/>
+          <w:lang w:val="en-US"/>
+        </w:rPr>
+        <w:t>lab</w:t>
+      </w:r>
+      <w:r>
+        <w:rPr>
+          <w:rStyle w:val="Hyperlink"/>
+        </w:rPr>
+        <w:t>1</w:t>
+      </w:r>
+    </w:p>
+    <w:p>
+      <w:pPr>
+        <w:rPr>
+          <w:rStyle w:val="Hyperlink"/>
+        </w:rPr>
+      </w:pPr>
+    </w:p>
+    <w:p/>
+    <w:p>
+      <w:pPr>
+        <w:pStyle w:val="Heading2"/>
+        <w:ind w:firstLine="567"/>
+      </w:pPr>
+      <w:r>
         <w:t>Список использованных источников</w:t>
       </w:r>
       <w:bookmarkEnd w:id="11"/>

</xml_diff>